<commit_message>
Ground demo data in real traces, add OSS-icon architecture diagram, Korean report, CLAUDE.md
Data representativeness: new app/core/workload.py generates 6 workload archetypes
(interactive/batch/steady) calibrated to Azure Resource Central (SOSP'17),
Alibaba 2018, and Barroso & Hölzle — 14 days hourly per host. 9 validation tests
assert diurnality, burstiness, low-utilisation, and forecastability (45 tests total).
docs/09_workload_modeling.md documents the grounding with citations.

Architecture diagram: scripts/build_architecture_diagram.py composes a layered
diagram from official Simple Icons (CC0) brand logos -> SVG + PNG, embedded in
README and both reports.

Report: development_report_usenix.docx fully rewritten in Korean with the
architecture diagram embedded; markdown reports + test spec updated to the new
fleet and 45-test count.

CLAUDE.md: captures the user's project requirements as standing instructions.

Co-Authored-By: Claude Opus 4.8 (1M context) <noreply@anthropic.com>
</commit_message>
<xml_diff>
--- a/docs/development_report_usenix.docx
+++ b/docs/development_report_usenix.docx
@@ -11,11 +11,12 @@
       </w:pPr>
       <w:r>
         <w:rPr>
+          <w:rFonts w:eastAsia="Malgun Gothic"/>
           <w:b/>
           <w:color w:val="000000"/>
           <w:sz w:val="28"/>
         </w:rPr>
-        <w:t>MetricLens AI: Lightweight Time-Series Forecasting and Integer-Programming Resizing for On-Premise Server Optimization</w:t>
+        <w:t>MetricLens AI: 온프레미스 서버 최적화를 위한 경량 시계열 예측과 정수계획 기반 리사이징</w:t>
       </w:r>
     </w:p>
     <w:p>
@@ -26,7 +27,10 @@
         </w:rPr>
       </w:pPr>
       <w:r>
-        <w:t>이용원 (Team Lead), 서한녕, 송심우</w:t>
+        <w:rPr>
+          <w:rFonts w:eastAsia="Malgun Gothic"/>
+        </w:rPr>
+        <w:t>이용원 (팀장), 서한녕, 송심우</w:t>
       </w:r>
     </w:p>
     <w:p>
@@ -39,39 +43,46 @@
       </w:pPr>
       <w:r>
         <w:rPr>
+          <w:rFonts w:eastAsia="Malgun Gothic"/>
           <w:color w:val="000000"/>
         </w:rPr>
         <w:t>Team 구글링 — googai_congress</w:t>
       </w:r>
       <w:r>
         <w:rPr>
+          <w:rFonts w:eastAsia="Malgun Gothic"/>
           <w:color w:val="000000"/>
         </w:rPr>
       </w:r>
       <w:r>
         <w:rPr>
+          <w:rFonts w:eastAsia="Malgun Gothic"/>
           <w:i/>
           <w:color w:val="000000"/>
         </w:rPr>
       </w:r>
       <w:r>
         <w:rPr>
+          <w:rFonts w:eastAsia="Malgun Gothic"/>
           <w:i/>
           <w:color w:val="000000"/>
         </w:rPr>
       </w:r>
       <w:r>
         <w:rPr>
+          <w:rFonts w:eastAsia="Malgun Gothic"/>
           <w:color w:val="000000"/>
         </w:rPr>
       </w:r>
       <w:r>
         <w:rPr>
+          <w:rFonts w:eastAsia="Malgun Gothic"/>
           <w:color w:val="000000"/>
         </w:rPr>
       </w:r>
       <w:r>
         <w:rPr>
+          <w:rFonts w:eastAsia="Malgun Gothic"/>
           <w:i/>
           <w:color w:val="000000"/>
         </w:rPr>
@@ -82,15 +93,21 @@
         <w:pStyle w:val="Header1"/>
       </w:pPr>
       <w:r>
-        <w:t>Abstract</w:t>
-      </w:r>
-    </w:p>
-    <w:p>
-      <w:pPr>
-        <w:pStyle w:val="Body"/>
-      </w:pPr>
-      <w:r>
-        <w:t>Over-provisioning dominates on-premise infrastructure: operators allocate far more capacity than workloads require, wasting OPEX and energy. MetricLens AI is a self-contained web platform that ingests multi-dimensional server metrics (CPU, memory, network I/O), forecasts future load with a lightweight CPU-only time-series model, and derives SLO-aware resizing recommendations via integer programming. The forecaster performs additive seasonal-trend decomposition with a block-mean trend estimator that suppresses seasonal leakage, and sizes its prediction interval from out-of-sample backtest error. The resizing engine solves an exact integer program over a bounded search space. The system is deployed GCP-natively on Cloud Run via a Cloud Build CI/CD pipeline. On a representative seven-day demo fleet the forecaster holds MAPE within the 15% target while the optimizer identifies up to 40% reclaimable capacity at 99.9% SLO confidence.</w:t>
+        <w:rPr>
+          <w:rFonts w:eastAsia="Malgun Gothic"/>
+        </w:rPr>
+        <w:t>초록 (Abstract)</w:t>
+      </w:r>
+    </w:p>
+    <w:p>
+      <w:pPr>
+        <w:pStyle w:val="Body"/>
+      </w:pPr>
+      <w:r>
+        <w:rPr>
+          <w:rFonts w:eastAsia="Malgun Gothic"/>
+        </w:rPr>
+        <w:t>온프레미스 인프라에서는 과프로비저닝이 만연하다. 운영자는 워크로드가 요구하는 것보다 훨씬 많은 자원을 할당하여 운영비(OPEX)와 전력을 낭비한다. MetricLens AI는 다차원 서버 메트릭(CPU·메모리·네트워크 I/O)을 적재하고, GPU 없이 CPU만으로 구동되는 경량 시계열 모델로 미래 부하를 예측하며, 정수 계획법으로 SLO를 보장하는 리사이징 권장안을 산출하는 자립형 웹 플랫폼이다. 예측기는 계절 누설을 억제하는 블록 평균 추세 추정기를 사용한 가산 계절-추세 분해를 수행하고, 예측 구간을 표본 외 백테스트 오차로 산정한다. 리사이징 엔진은 유계 탐색 공간에서 정확한 정수계획을 푼다. 시스템은 Cloud Build CI/CD 파이프라인을 통해 Cloud Run에 GCP 네이티브로 배포된다. 공개 트레이스에 근거한 대표 데모 플릿에서 대화형 호스트의 MAPE는 9–13%로 15% 목표를 충족하며, 최적화기는 99.9% SLO 신뢰도에서 최대 약 54%의 회수 가능 용량을 식별한다.</w:t>
       </w:r>
     </w:p>
     <w:p>
@@ -98,23 +115,32 @@
         <w:pStyle w:val="Header1"/>
       </w:pPr>
       <w:r>
-        <w:t>1. Introduction</w:t>
-      </w:r>
-    </w:p>
-    <w:p>
-      <w:pPr>
-        <w:pStyle w:val="Body"/>
-      </w:pPr>
-      <w:r>
-        <w:t>Conservative capacity planning leaves servers chronically idle. Public-cloud optimizers are unavailable in air-gapped or regulated on-premise environments, so operators lack data-driven sizing tools. MetricLens AI targets this gap: an external-dependency-free, GPU-free system that turns historical telemetry into quantitative right-sizing guidance such as "this host peaks at 26% of 16 vCPU; halving it preserves 99.9% availability."</w:t>
-      </w:r>
-    </w:p>
-    <w:p>
-      <w:pPr>
-        <w:pStyle w:val="Body"/>
-      </w:pPr>
-      <w:r>
-        <w:t>The contributions are: (i) a standard-library seasonal-trend forecaster whose block-mean trend estimator avoids the seasonal leakage of naive least squares; (ii) an exact integer-programming resizing engine with a percentile-peak safety statistic; (iii) a layered FastAPI service and React/ECharts dashboard; and (iv) a reproducible Cloud Build to Cloud Run deployment.</w:t>
+        <w:rPr>
+          <w:rFonts w:eastAsia="Malgun Gothic"/>
+        </w:rPr>
+        <w:t>1. 서론</w:t>
+      </w:r>
+    </w:p>
+    <w:p>
+      <w:pPr>
+        <w:pStyle w:val="Body"/>
+      </w:pPr>
+      <w:r>
+        <w:rPr>
+          <w:rFonts w:eastAsia="Malgun Gothic"/>
+        </w:rPr>
+        <w:t>보수적인 용량 산정은 서버를 만성적으로 유휴 상태로 둔다. 퍼블릭 클라우드 최적화 도구는 망분리·규제 온프레미스 환경에서 사용할 수 없어, 운영자는 데이터 기반 사이징 수단을 갖지 못한다. MetricLens AI는 이 공백을 겨냥한다: 외부 의존성이 없고 GPU가 필요 없는 시스템으로, 과거 텔레메트리를 정량적 라이트사이징 지침으로 전환한다(예: "이 호스트는 16 vCPU의 26%에서 피크를 이루므로 절반으로 줄여도 99.9% 가용성을 유지한다").</w:t>
+      </w:r>
+    </w:p>
+    <w:p>
+      <w:pPr>
+        <w:pStyle w:val="Body"/>
+      </w:pPr>
+      <w:r>
+        <w:rPr>
+          <w:rFonts w:eastAsia="Malgun Gothic"/>
+        </w:rPr>
+        <w:t>기여는 다음과 같다: (i) 단순 최소제곱의 계절 누설을 피하는 블록 평균 추세 추정기를 갖춘 표준 라이브러리 계절-추세 예측기; (ii) 백분위 피크 안전 통계를 갖춘 정확한 정수계획 리사이징 엔진; (iii) 레이어드 FastAPI 서비스와 React/ECharts 대시보드; (iv) 재현 가능한 Cloud Build → Cloud Run 배포; (v) 공개 데이터센터 트레이스에 근거하여 통계적 대표성을 갖춘 시험 데이터.</w:t>
       </w:r>
     </w:p>
     <w:p>
@@ -122,15 +148,68 @@
         <w:pStyle w:val="Header1"/>
       </w:pPr>
       <w:r>
-        <w:t>2. System Architecture</w:t>
-      </w:r>
-    </w:p>
-    <w:p>
-      <w:pPr>
-        <w:pStyle w:val="Body"/>
-      </w:pPr>
-      <w:r>
-        <w:t>The system follows a three-tier layered architecture. The presentation tier is a React 19 single-page application rendering large time series with Canvas-based ECharts, served by an unprivileged nginx container. The business tier is a single FastAPI application internally separated into Controller, Service, and Repository layers, with the forecasting and optimization algorithms isolated in a pure, dependency-free core. The data tier is PostgreSQL in production (Cloud SQL) and an embedded SQLite database for the self-contained demo profile.</w:t>
+        <w:rPr>
+          <w:rFonts w:eastAsia="Malgun Gothic"/>
+        </w:rPr>
+        <w:t>2. 시스템 아키텍처</w:t>
+      </w:r>
+    </w:p>
+    <w:p>
+      <w:pPr>
+        <w:pStyle w:val="Body"/>
+      </w:pPr>
+      <w:r>
+        <w:rPr>
+          <w:rFonts w:eastAsia="Malgun Gothic"/>
+        </w:rPr>
+        <w:t>시스템은 3계층 레이어드 아키텍처를 따른다. 표현 계층은 Canvas 기반 ECharts로 대용량 시계열을 렌더링하는 React 19 단일 페이지 애플리케이션으로, 비특권 nginx 컨테이너가 서빙한다. 업무 계층은 내부적으로 Controller·Service·Repository로 분리된 단일 FastAPI 애플리케이션이며, 예측·최적화 알고리즘은 순수하고 의존성 없는 Core에 격리된다. 데이터 계층은 프로덕션에서 PostgreSQL(Cloud SQL), 자립형 데모 프로파일에서 내장 SQLite이다.</w:t>
+      </w:r>
+    </w:p>
+    <w:p>
+      <w:r>
+        <w:drawing>
+          <wp:inline xmlns:a="http://schemas.openxmlformats.org/drawingml/2006/main" xmlns:pic="http://schemas.openxmlformats.org/drawingml/2006/picture">
+            <wp:extent cx="3017520" cy="2293315"/>
+            <wp:docPr id="1" name="Picture 1"/>
+            <wp:cNvGraphicFramePr>
+              <a:graphicFrameLocks noChangeAspect="1"/>
+            </wp:cNvGraphicFramePr>
+            <a:graphic>
+              <a:graphicData uri="http://schemas.openxmlformats.org/drawingml/2006/picture">
+                <pic:pic>
+                  <pic:nvPicPr>
+                    <pic:cNvPr id="0" name="architecture.png"/>
+                    <pic:cNvPicPr/>
+                  </pic:nvPicPr>
+                  <pic:blipFill>
+                    <a:blip r:embed="rId6"/>
+                    <a:stretch>
+                      <a:fillRect/>
+                    </a:stretch>
+                  </pic:blipFill>
+                  <pic:spPr>
+                    <a:xfrm>
+                      <a:off x="0" y="0"/>
+                      <a:ext cx="3017520" cy="2293315"/>
+                    </a:xfrm>
+                    <a:prstGeom prst="rect"/>
+                  </pic:spPr>
+                </pic:pic>
+              </a:graphicData>
+            </a:graphic>
+          </wp:inline>
+        </w:drawing>
+      </w:r>
+    </w:p>
+    <w:p>
+      <w:pPr>
+        <w:pStyle w:val="Body"/>
+      </w:pPr>
+      <w:r>
+        <w:rPr>
+          <w:rFonts w:eastAsia="Malgun Gothic"/>
+        </w:rPr>
+        <w:t>그림 1. 공식 오픈소스 브랜드 로고(Simple Icons, CC0)로 구성한 시스템 아키텍처.</w:t>
       </w:r>
     </w:p>
     <w:p>
@@ -138,15 +217,21 @@
         <w:pStyle w:val="Header2"/>
       </w:pPr>
       <w:r>
-        <w:t>2.1. Layered separation</w:t>
-      </w:r>
-    </w:p>
-    <w:p>
-      <w:pPr>
-        <w:pStyle w:val="Body"/>
-      </w:pPr>
-      <w:r>
-        <w:t>Dependencies flow strictly downward. Controllers validate request and response schemas and map domain errors to HTTP status codes. Services own domain rules — identifier minting, metric selection, horizon conversion, and peak computation. Repositories are the only layer that issues SQL. Because the core depends on no other layer, it is unit tested without a database.</w:t>
+        <w:rPr>
+          <w:rFonts w:eastAsia="Malgun Gothic"/>
+        </w:rPr>
+        <w:t>2.1. 계층 분리</w:t>
+      </w:r>
+    </w:p>
+    <w:p>
+      <w:pPr>
+        <w:pStyle w:val="Body"/>
+      </w:pPr>
+      <w:r>
+        <w:rPr>
+          <w:rFonts w:eastAsia="Malgun Gothic"/>
+        </w:rPr>
+        <w:t>의존성은 엄격히 아래로만 흐른다. 컨트롤러는 요청·응답 스키마를 검증하고 도메인 오류를 HTTP 상태 코드로 매핑한다. 서비스는 도메인 규칙(식별자 발급, 메트릭 선택, 지평 변환, 피크 계산)을 소유한다. 리포지토리만이 SQL을 발행한다. Core는 다른 계층에 의존하지 않으므로 데이터베이스 없이 단위 테스트된다.</w:t>
       </w:r>
     </w:p>
     <w:p>
@@ -154,23 +239,32 @@
         <w:pStyle w:val="Header1"/>
       </w:pPr>
       <w:r>
-        <w:t>3. Lightweight Forecasting Engine</w:t>
-      </w:r>
-    </w:p>
-    <w:p>
-      <w:pPr>
-        <w:pStyle w:val="Body"/>
-      </w:pPr>
-      <w:r>
-        <w:t>The forecaster models a series as the additive sum of trend, seasonal, and residual components. The trend is estimated by ordinary least squares over per-period block means; averaging across a full seasonal period cancels the periodic component, so it cannot leak into the slope — the classical decomposition correction for the bias of global least squares on periodic data. Seasonal indices are the mean detrended value per phase, re-centred to sum to zero.</w:t>
-      </w:r>
-    </w:p>
-    <w:p>
-      <w:pPr>
-        <w:pStyle w:val="Body"/>
-      </w:pPr>
-      <w:r>
-        <w:t>Forecasts extrapolate trend plus seasonal index at the target horizon. The prediction interval is sized from out-of-sample one-step backtest error (RMSE) rather than in-sample residuals, which would understate uncertainty on short, over-parameterised series. Model quality is reported as MAPE with a denominator floor, the standard robustness variant that prevents near-idle samples from inflating the percentage. The engine uses only the Python standard library, carrying no native dependency and a negligible container footprint.</w:t>
+        <w:rPr>
+          <w:rFonts w:eastAsia="Malgun Gothic"/>
+        </w:rPr>
+        <w:t>3. 경량 예측 엔진</w:t>
+      </w:r>
+    </w:p>
+    <w:p>
+      <w:pPr>
+        <w:pStyle w:val="Body"/>
+      </w:pPr>
+      <w:r>
+        <w:rPr>
+          <w:rFonts w:eastAsia="Malgun Gothic"/>
+        </w:rPr>
+        <w:t>예측기는 시계열을 추세·계절·잔차의 가산합으로 모델링한다. 추세는 주기별 블록 평균에 대한 최소제곱으로 추정한다. 한 계절 주기 전체를 평균하면 주기 성분이 상쇄되어 기울기로 누설될 수 없다 — 주기 데이터에 대한 전역 최소제곱의 편향을 교정하는 고전적 분해 기법이다. 계절 지수는 위상별 평균 탈추세 값을 0합으로 재중심화한 것이다.</w:t>
+      </w:r>
+    </w:p>
+    <w:p>
+      <w:pPr>
+        <w:pStyle w:val="Body"/>
+      </w:pPr>
+      <w:r>
+        <w:rPr>
+          <w:rFonts w:eastAsia="Malgun Gothic"/>
+        </w:rPr>
+        <w:t>예측은 목표 지평에서 추세에 계절 지수를 더해 외삽한다. 예측 구간은 표본 내 잔차가 아니라 표본 외 1-스텝 백테스트 오차(RMSE)로 산정하여, 짧고 과적합되기 쉬운 시계열에서 불확실성을 과소평가하지 않는다. 모델 품질은 분모 바닥값을 둔 MAPE로 보고하여 준유휴 표본이 백분율을 부풀리지 않게 한다. 엔진은 Python 표준 라이브러리만 사용하므로 네이티브 의존성과 컨테이너 풋프린트가 무시할 수준이다.</w:t>
       </w:r>
     </w:p>
     <w:p>
@@ -178,15 +272,43 @@
         <w:pStyle w:val="Header1"/>
       </w:pPr>
       <w:r>
-        <w:t>4. Integer-Programming Resizing</w:t>
-      </w:r>
-    </w:p>
-    <w:p>
-      <w:pPr>
-        <w:pStyle w:val="Body"/>
-      </w:pPr>
-      <w:r>
-        <w:t>Given current allocation and forecasted peak load, the engine selects the smallest integer allocation that keeps projected peak utilisation at or below a target while preserving a safety margin for the SLO: peak_load × margin ≤ target_utilisation × allocation. The search space is small and bounded (vCPU in [1, current]; memory in 256 MB blocks), so the optimum is found by exhaustive enumeration — an exact solver requiring no external dependency. A 95th-percentile peak statistic prevents a single transient spike from forcing permanent over-provisioning.</w:t>
+        <w:rPr>
+          <w:rFonts w:eastAsia="Malgun Gothic"/>
+        </w:rPr>
+        <w:t>4. 정수계획 리사이징</w:t>
+      </w:r>
+    </w:p>
+    <w:p>
+      <w:pPr>
+        <w:pStyle w:val="Body"/>
+      </w:pPr>
+      <w:r>
+        <w:rPr>
+          <w:rFonts w:eastAsia="Malgun Gothic"/>
+        </w:rPr>
+        <w:t>현재 할당과 예측 피크 부하가 주어지면, 엔진은 SLO를 위한 안전 마진을 유지하면서 예측 피크 가동률을 목표 이하로 유지하는 최소 정수 할당을 선택한다: peak_load × margin ≤ target_utilisation × allocation. 탐색 공간은 작고 유계(vCPU는 [1, 현재], 메모리는 256MB 블록)이므로 전수 열거로 최적해를 구한다 — 외부 의존성이 필요 없는 정확 해법이다. 95퍼센타일 피크 통계는 단발 스파이크가 영구 과프로비저닝을 강요하지 않게 한다. 실제로 버스트성 배치 호스트는 p95 안전 통계 덕분에 다운사이징이 올바르게 차단된다.</w:t>
+      </w:r>
+    </w:p>
+    <w:p>
+      <w:pPr>
+        <w:pStyle w:val="Header2"/>
+      </w:pPr>
+      <w:r>
+        <w:rPr>
+          <w:rFonts w:eastAsia="Malgun Gothic"/>
+        </w:rPr>
+        <w:t>4.1. GCP 머신 타입 매핑</w:t>
+      </w:r>
+    </w:p>
+    <w:p>
+      <w:pPr>
+        <w:pStyle w:val="Body"/>
+      </w:pPr>
+      <w:r>
+        <w:rPr>
+          <w:rFonts w:eastAsia="Malgun Gothic"/>
+        </w:rPr>
+        <w:t>추상적 (vcpu, memory) 권장값은 E2·N2·C2·C3 등 사전정의 GCP 인스턴스 카탈로그에서 가장 근접한 실제 인스턴스로 스냅된다. 대시보드는 이를 "n2-standard-8"처럼 주문 가능한 사양으로 표시하고, 머신 타입 드롭다운으로 임의의 GCP 인스턴스로 직접 리사이즈할 수 있다.</w:t>
       </w:r>
     </w:p>
     <w:p>
@@ -194,15 +316,21 @@
         <w:pStyle w:val="Header1"/>
       </w:pPr>
       <w:r>
-        <w:t>5. Implementation and Deployment</w:t>
-      </w:r>
-    </w:p>
-    <w:p>
-      <w:pPr>
-        <w:pStyle w:val="Body"/>
-      </w:pPr>
-      <w:r>
-        <w:t>The backend is FastAPI with SQLAlchemy 2.0 async and asyncpg; the frontend is React 19 built with Vite and served by nginx. Both run as non-root containers honouring Cloud Run's injected port. A Cloud Build pipeline runs lint and tests, builds and pushes both images to Artifact Registry, deploys to Cloud Run with a rolling update, grants public invoker access, and performs a post-deploy health check, failing the build if the service is unhealthy. Secrets are injected at runtime from Secret Manager and are never committed.</w:t>
+        <w:rPr>
+          <w:rFonts w:eastAsia="Malgun Gothic"/>
+        </w:rPr>
+        <w:t>5. 구현 및 배포</w:t>
+      </w:r>
+    </w:p>
+    <w:p>
+      <w:pPr>
+        <w:pStyle w:val="Body"/>
+      </w:pPr>
+      <w:r>
+        <w:rPr>
+          <w:rFonts w:eastAsia="Malgun Gothic"/>
+        </w:rPr>
+        <w:t>백엔드는 SQLAlchemy 2.0 async와 asyncpg를 쓰는 FastAPI이고, 프론트엔드는 Vite로 빌드하여 nginx가 서빙하는 React 19이다. 둘 다 Cloud Run이 주입한 포트를 따르는 비루트 컨테이너로 실행된다. Cloud Build 파이프라인은 린트와 테스트를 수행하고 두 이미지를 빌드하여 Artifact Registry에 푸시하며, 롤링 업데이트로 Cloud Run에 배포하고 공개 호출 권한을 부여한 뒤 배포 후 헬스 체크를 수행하여 비정상 시 빌드를 실패시킨다. 비밀값은 런타임에 Secret Manager에서 주입되며 절대 커밋되지 않는다.</w:t>
       </w:r>
     </w:p>
     <w:p>
@@ -210,31 +338,43 @@
         <w:pStyle w:val="Header2"/>
       </w:pPr>
       <w:r>
-        <w:t>5.1. Interactive resizing and audit trail</w:t>
-      </w:r>
-    </w:p>
-    <w:p>
-      <w:pPr>
-        <w:pStyle w:val="Body"/>
-      </w:pPr>
-      <w:r>
-        <w:t>The dashboard exposes the predict-resize loop directly: operators run a forecast, then halve, double, or apply the AI-recommended allocation. Each action is a real, persisted change to the host record and is written to an audit-log table, surfaced as a live activity feed showing exactly how much capacity was reclaimed (e.g. "Downsized web-prod-01: 16-&gt;8 vCPU, 32-&gt;16 GB, +50% capacity"). A radial gauge recomputes projected peak utilisation in real time as the allocation changes, making the cost/headroom trade-off immediately legible.</w:t>
-      </w:r>
-    </w:p>
-    <w:p>
-      <w:pPr>
-        <w:pStyle w:val="Body"/>
-      </w:pPr>
-      <w:r>
-        <w:t>Live dashboard: https://metriclens-frontend-f2ei3uwvfq-uc.a.run.app</w:t>
-      </w:r>
-    </w:p>
-    <w:p>
-      <w:pPr>
-        <w:pStyle w:val="Body"/>
-      </w:pPr>
-      <w:r>
-        <w:t>Live API (Swagger at /docs): https://metriclens-backend-f2ei3uwvfq-uc.a.run.app</w:t>
+        <w:rPr>
+          <w:rFonts w:eastAsia="Malgun Gothic"/>
+        </w:rPr>
+        <w:t>5.1. 인터랙티브 리사이징과 감사 추적</w:t>
+      </w:r>
+    </w:p>
+    <w:p>
+      <w:pPr>
+        <w:pStyle w:val="Body"/>
+      </w:pPr>
+      <w:r>
+        <w:rPr>
+          <w:rFonts w:eastAsia="Malgun Gothic"/>
+        </w:rPr>
+        <w:t>대시보드는 예측-리사이즈 루프를 직접 노출한다: 운영자는 예측을 실행한 뒤 절반/두 배/AI 권장 할당을 적용한다. 각 동작은 호스트 레코드에 대한 실제 영속 변경이며 감사 로그 테이블에 기록되어, 얼마만큼의 용량이 회수되었는지를 실시간 활동 피드로 보여준다(예: "Downsized web-prod-01: 16-&gt;9 vCPU, 32-&gt;23 GB"). 방사형 게이지는 할당 변경에 따라 예측 피크 가동률을 실시간 재계산한다. 또한 각 지표에는 의미를 설명하는 정보(i) 아이콘을 두었고, UI는 반응형으로 구성했다.</w:t>
+      </w:r>
+    </w:p>
+    <w:p>
+      <w:pPr>
+        <w:pStyle w:val="Body"/>
+      </w:pPr>
+      <w:r>
+        <w:rPr>
+          <w:rFonts w:eastAsia="Malgun Gothic"/>
+        </w:rPr>
+        <w:t>라이브 대시보드: https://metriclens-frontend-f2ei3uwvfq-uc.a.run.app</w:t>
+      </w:r>
+    </w:p>
+    <w:p>
+      <w:pPr>
+        <w:pStyle w:val="Body"/>
+      </w:pPr>
+      <w:r>
+        <w:rPr>
+          <w:rFonts w:eastAsia="Malgun Gothic"/>
+        </w:rPr>
+        <w:t>라이브 API (Swagger /docs): https://metriclens-backend-f2ei3uwvfq-uc.a.run.app</w:t>
       </w:r>
     </w:p>
     <w:p>
@@ -242,7 +382,7 @@
         <w:drawing>
           <wp:inline xmlns:a="http://schemas.openxmlformats.org/drawingml/2006/main" xmlns:pic="http://schemas.openxmlformats.org/drawingml/2006/picture">
             <wp:extent cx="3017520" cy="4005286"/>
-            <wp:docPr id="1" name="Picture 1"/>
+            <wp:docPr id="2" name="Picture 2"/>
             <wp:cNvGraphicFramePr>
               <a:graphicFrameLocks noChangeAspect="1"/>
             </wp:cNvGraphicFramePr>
@@ -254,7 +394,7 @@
                     <pic:cNvPicPr/>
                   </pic:nvPicPr>
                   <pic:blipFill>
-                    <a:blip r:embed="rId6"/>
+                    <a:blip r:embed="rId7"/>
                     <a:stretch>
                       <a:fillRect/>
                     </a:stretch>
@@ -278,15 +418,32 @@
         <w:pStyle w:val="Header1"/>
       </w:pPr>
       <w:r>
-        <w:t>6. Evaluation</w:t>
-      </w:r>
-    </w:p>
-    <w:p>
-      <w:pPr>
-        <w:pStyle w:val="Body"/>
-      </w:pPr>
-      <w:r>
-        <w:t>The quality gate runs ruff static analysis and a 27-case pytest suite (8 forecaster, 9 optimizer, 10 API), all passing. Unit tests follow boundary-value analysis and equivalence partitioning; integration tests exercise the full controller-service-core path against in-memory repositories, requiring no live database. On a representative seven-day demo fleet of three hosts, forecast MAPE is 4–7% — within the 15% target — and the optimizer recommends, for example, a 16→8 vCPU reduction (40% saving) on an over-provisioned production host while holding a right-sized host unchanged, all at 99.9% SLO confidence.</w:t>
+        <w:rPr>
+          <w:rFonts w:eastAsia="Malgun Gothic"/>
+        </w:rPr>
+        <w:t>6. 시험 데이터의 통계적 대표성</w:t>
+      </w:r>
+    </w:p>
+    <w:p>
+      <w:pPr>
+        <w:pStyle w:val="Body"/>
+      </w:pPr>
+      <w:r>
+        <w:rPr>
+          <w:rFonts w:eastAsia="Malgun Gothic"/>
+        </w:rPr>
+        <w:t>데모/시드 메트릭은 임의가 아니라 공개된 대규모 데이터센터 트레이스의 실측 통계에 근거한다. Azure Resource Central(Cortez 외, SOSP 2017)에 따르면 VM의 60%가 평균 CPU 20% 미만, 40%가 95퍼센타일 CPU 50% 미만이며, VM은 대화형(일주기)과 지연무관(배치·개발/테스트)으로 나뉜다. Barroso &amp; Hölzle는 서버가 대부분 10–50% 가동 대역에 머문다고 보고했고, Alibaba 2018 트레이스는 배치 전용 서버 평균 29.3%, 서비스 전용 7.4% CPU를 보고했다.</w:t>
+      </w:r>
+    </w:p>
+    <w:p>
+      <w:pPr>
+        <w:pStyle w:val="Body"/>
+      </w:pPr>
+      <w:r>
+        <w:rPr>
+          <w:rFonts w:eastAsia="Malgun Gothic"/>
+        </w:rPr>
+        <w:t>이에 따라 데모 플릿을 6개 워크로드 아키타입(대화형 웹/대화형 API/정상상태 캐시/버스트 배치/과프로비저닝 서비스/산발적 개발)으로 구성하고, 호스트당 14일 × 시간단위 = 336표본(총 2,016표본)을 결정론적으로 생성한다. 자동 시험은 생성 데이터가 일주기성·버스트성·정상상태·저활용·대화형 예측가능성(MAPE ≤ 15%)을 재현하는지 단언한다.</w:t>
       </w:r>
     </w:p>
     <w:p>
@@ -294,23 +451,21 @@
         <w:pStyle w:val="Header1"/>
       </w:pPr>
       <w:r>
-        <w:t>7. Related Work and Differentiation</w:t>
-      </w:r>
-    </w:p>
-    <w:p>
-      <w:pPr>
-        <w:pStyle w:val="Body"/>
-      </w:pPr>
-      <w:r>
-        <w:t>The optimisation market splits into three groups. (a) Kubernetes/cloud SaaS optimizers — CAST AI, Sedai, StormForge, PerfectScale, Kubecost — autonomously tune pod/node requests with per-workload ML, but ship telemetry to a vendor cloud and assume Kubernetes on a public cloud. (b) Cloud-provider recommenders — AWS Compute Optimizer, Azure Advisor, Google Active Assist, IBM Turbonomic — are tied to a single provider, cover limited instance families, and rely on short (~14-day) windows that weaken on seasonal or bursty load. (c) On-premise capacity monitors — SolarWinds, ManageEngine, IDERA — run on-prem but are largely descriptive, flagging under/over-utilised hosts via thresholds or linear regression without solving a constrained optimisation.</w:t>
-      </w:r>
-    </w:p>
-    <w:p>
-      <w:pPr>
-        <w:pStyle w:val="Body"/>
-      </w:pPr>
-      <w:r>
-        <w:t>MetricLens occupies the gap between them. It is (1) air-gapped and self-contained — no external API, SaaS callback, or telemetry egress, so it suits regulated, network-isolated estates (defense, finance, public sector under CUI/GDPR/DORA) that SaaS optimizers structurally cannot serve; (2) GPU-free and lightweight, running its standard-library forecaster on commodity CPUs; (3) prescriptive, solving an exact SLO-constrained integer program rather than merely reporting idleness; (4) a white-box — MAPE, prediction intervals, and the headroom inequality make every decision auditable; and (5) infrastructure-agnostic, modelling generic VM/bare-metal hosts rather than Kubernetes pods.</w:t>
+        <w:rPr>
+          <w:rFonts w:eastAsia="Malgun Gothic"/>
+        </w:rPr>
+        <w:t>7. 평가</w:t>
+      </w:r>
+    </w:p>
+    <w:p>
+      <w:pPr>
+        <w:pStyle w:val="Body"/>
+      </w:pPr>
+      <w:r>
+        <w:rPr>
+          <w:rFonts w:eastAsia="Malgun Gothic"/>
+        </w:rPr>
+        <w:t>품질 게이트는 ruff 정적 분석과 45개 pytest 스위트(예측기 8, 최적화기 9, API 13, 머신타입 6, 워크로드 9)를 실행하며 전부 통과한다. 단위 시험은 경계값 분석과 동등 분할을 따르고, 통합 시험은 인메모리 리포지토리로 전체 Controller-Service-Core 경로를 구동하여 라이브 DB가 필요 없다. 근거 기반 6호스트 플릿에서 대화형 호스트의 MAPE는 9–13%로 15% 목표 이내이며, 최적화기는 과프로비저닝 호스트를 정확히 축소(web-prod-01 16→9 vCPU ≈36%, api-staging-02 ≈54%)하는 한편 중부하·버스트 호스트는 유지하고 메모리 바운드 캐시는 CPU만 축소한다 — 모두 99.9% SLO 신뢰도에서.</w:t>
       </w:r>
     </w:p>
     <w:p>
@@ -318,15 +473,54 @@
         <w:pStyle w:val="Header1"/>
       </w:pPr>
       <w:r>
-        <w:t>8. Conclusion</w:t>
-      </w:r>
-    </w:p>
-    <w:p>
-      <w:pPr>
-        <w:pStyle w:val="Body"/>
-      </w:pPr>
-      <w:r>
-        <w:t>MetricLens AI demonstrates that accurate, CPU-only load forecasting and exact integer-programming resizing can be delivered as a dependency-free, cloud-native service. By converting passive telemetry into quantitative, SLO-aware sizing guidance, it shifts capacity management from reactive to proactive and provides a practical path to reducing infrastructure cost and energy waste in on-premise environments.</w:t>
+        <w:rPr>
+          <w:rFonts w:eastAsia="Malgun Gothic"/>
+        </w:rPr>
+        <w:t>8. 관련 연구 및 차별화</w:t>
+      </w:r>
+    </w:p>
+    <w:p>
+      <w:pPr>
+        <w:pStyle w:val="Body"/>
+      </w:pPr>
+      <w:r>
+        <w:rPr>
+          <w:rFonts w:eastAsia="Malgun Gothic"/>
+        </w:rPr>
+        <w:t>최적화 시장은 세 그룹으로 나뉜다. (a) 쿠버네티스/클라우드 SaaS 최적화기(CAST AI, Sedai, StormForge, PerfectScale, Kubecost)는 워크로드별 ML로 파드/노드 요청을 자율 튜닝하지만 텔레메트리를 벤더 클라우드로 전송하고 퍼블릭 클라우드 상의 쿠버네티스를 전제한다. (b) 클라우드 제공자 추천기(AWS Compute Optimizer, Azure Advisor, Google Active Assist, IBM Turbonomic)는 단일 제공자에 종속되고 인스턴스 패밀리가 제한적이며 짧은(~14일) 윈도우에 의존해 계절성·버스트에 약하다. (c) 온프레 용량 모니터(SolarWinds, ManageEngine, IDERA)는 온프레에서 동작하나 임계치·선형회귀 기반의 서술적 리포팅에 그쳐 제약 최적화를 풀지 않는다.</w:t>
+      </w:r>
+    </w:p>
+    <w:p>
+      <w:pPr>
+        <w:pStyle w:val="Body"/>
+      </w:pPr>
+      <w:r>
+        <w:rPr>
+          <w:rFonts w:eastAsia="Malgun Gothic"/>
+        </w:rPr>
+        <w:t>MetricLens는 그 사이의 공백을 차지한다. (1) 에어갭·자립형 — 외부 API·SaaS 콜백·텔레메트리 유출이 없어 SaaS 최적화기가 구조적으로 진입할 수 없는 규제·망분리 환경(국방·금융·공공: CUI/GDPR/DORA)에 적합하다; (2) GPU-프리 경량 — 표준 라이브러리 예측기를 범용 CPU에서 구동한다; (3) 처방적 — 유휴를 보고하는 데 그치지 않고 SLO 제약 정수계획을 정확히 푼다; (4) 화이트박스 — MAPE·예측 구간·헤드룸 부등식으로 모든 결정을 감사 가능하게 한다; (5) 인프라 비종속 — 쿠버네티스 파드가 아니라 일반 VM/베어메탈 호스트를 모델링한다.</w:t>
+      </w:r>
+    </w:p>
+    <w:p>
+      <w:pPr>
+        <w:pStyle w:val="Header1"/>
+      </w:pPr>
+      <w:r>
+        <w:rPr>
+          <w:rFonts w:eastAsia="Malgun Gothic"/>
+        </w:rPr>
+        <w:t>9. 결론</w:t>
+      </w:r>
+    </w:p>
+    <w:p>
+      <w:pPr>
+        <w:pStyle w:val="Body"/>
+      </w:pPr>
+      <w:r>
+        <w:rPr>
+          <w:rFonts w:eastAsia="Malgun Gothic"/>
+        </w:rPr>
+        <w:t>MetricLens AI는 정확한 CPU-온리 부하 예측과 정확한 정수계획 리사이징을 의존성 없는 클라우드 네이티브 서비스로 제공할 수 있음을 보인다. 수동적 텔레메트리를 정량적·SLO 인지 사이징 지침으로 전환함으로써 용량 관리를 반응형에서 선제형으로 전환하고, 온프레미스 환경의 인프라 비용과 전력 낭비를 줄이는 실용적 경로를 제시한다.</w:t>
       </w:r>
     </w:p>
     <w:sectPr>

</xml_diff>

<commit_message>
Paper-level model evaluation with figures; overhaul USENIX report
Evaluation: add academic statistics to evaluation.py (MASE per Hyndman&Koehler
2006, sMAPE, MPIW, Diebold-Mariano test 1995, aligned backtest_run).
scripts/evaluate_model_paper.py renders 5 publication figures (forecast overlay
with 95% PI, RMSE vs baselines, MASE, PICP coverage, residual ACF) to
docs/evaluation/. Result: model beats seasonal-naive 6/6 (RMSE), MASE<1 on 5/6,
Diebold-Mariano p<0.05 on 4/6, coverage 0.93-0.98.

Report: development_report_usenix.docx fully overhauled (Korean) to cover the
real-GCP monitoring/resize, representative data, and a new paper-level evaluation
section embedding all figures; added an explicit '구동 방식' architecture section.
6 figures embedded. docs/11_model_evaluation.md mirrors it for the repo.

Co-Authored-By: Claude Opus 4.8 (1M context) <noreply@anthropic.com>
</commit_message>
<xml_diff>
--- a/docs/development_report_usenix.docx
+++ b/docs/development_report_usenix.docx
@@ -107,7 +107,7 @@
         <w:rPr>
           <w:rFonts w:eastAsia="Malgun Gothic"/>
         </w:rPr>
-        <w:t>온프레미스 인프라에서는 과프로비저닝이 만연하다. 운영자는 워크로드가 요구하는 것보다 훨씬 많은 자원을 할당하여 운영비(OPEX)와 전력을 낭비한다. MetricLens AI는 다차원 서버 메트릭(CPU·메모리·네트워크 I/O)을 적재하고, GPU 없이 CPU만으로 구동되는 경량 시계열 모델로 미래 부하를 예측하며, 정수 계획법으로 SLO를 보장하는 리사이징 권장안을 산출하는 자립형 웹 플랫폼이다. 예측기는 계절 누설을 억제하는 블록 평균 추세 추정기를 사용한 가산 계절-추세 분해를 수행하고, 예측 구간을 표본 외 백테스트 오차로 산정한다. 리사이징 엔진은 유계 탐색 공간에서 정확한 정수계획을 푼다. 시스템은 Cloud Build CI/CD 파이프라인을 통해 Cloud Run에 GCP 네이티브로 배포된다. 공개 트레이스에 근거한 대표 데모 플릿에서 대화형 호스트의 MAPE는 9–13%로 15% 목표를 충족하며, 최적화기는 99.9% SLO 신뢰도에서 최대 약 54%의 회수 가능 용량을 식별한다.</w:t>
+        <w:t>온프레미스 인프라는 과프로비저닝이 만연해 운영비와 전력을 낭비한다. MetricLens AI는 다차원 서버 메트릭(CPU·메모리·네트워크)을 적재하고, GPU 없이 CPU만으로 구동되는 경량 시계열 모델로 부하를 예측하며, 정수계획법으로 SLO를 보장하는 최소 자원 구성을 산출하는 자립형 웹 플랫폼이다. 예측기는 계절-추세 분해에 AR(1) 잔차 보정을 결합하고, 예측 구간을 표본 외 백테스트 오차로 산정한다. 리사이징 엔진은 유계 탐색 공간에서 정확한 정수계획을 푼다. 시스템은 Cloud Build CI/CD로 Cloud Run에 GCP 네이티브 배포되며, Cloud Monitoring으로 실제 Compute Engine 인스턴스의 메트릭을 적재하고 예산 한도 내에서 실제 VM을 리사이즈한다. 공개 데이터센터 트레이스(Azure·Alibaba)에 근거한 대표 데이터에서, 모델은 6개 워크로드 아키타입 모두에서 seasonal-naive 기준선을 RMSE로 능가하고 (5/6에서 두 기준선 모두 능가, Diebold-Mariano p&lt;0.05 4/6), 95% 예측구간 커버리지는 0.93–0.98로 잘 보정된다.</w:t>
       </w:r>
     </w:p>
     <w:p>
@@ -129,18 +129,18 @@
         <w:rPr>
           <w:rFonts w:eastAsia="Malgun Gothic"/>
         </w:rPr>
-        <w:t>보수적인 용량 산정은 서버를 만성적으로 유휴 상태로 둔다. 퍼블릭 클라우드 최적화 도구는 망분리·규제 온프레미스 환경에서 사용할 수 없어, 운영자는 데이터 기반 사이징 수단을 갖지 못한다. MetricLens AI는 이 공백을 겨냥한다: 외부 의존성이 없고 GPU가 필요 없는 시스템으로, 과거 텔레메트리를 정량적 라이트사이징 지침으로 전환한다(예: "이 호스트는 16 vCPU의 26%에서 피크를 이루므로 절반으로 줄여도 99.9% 가용성을 유지한다").</w:t>
-      </w:r>
-    </w:p>
-    <w:p>
-      <w:pPr>
-        <w:pStyle w:val="Body"/>
-      </w:pPr>
-      <w:r>
-        <w:rPr>
-          <w:rFonts w:eastAsia="Malgun Gothic"/>
-        </w:rPr>
-        <w:t>기여는 다음과 같다: (i) 단순 최소제곱의 계절 누설을 피하는 블록 평균 추세 추정기를 갖춘 표준 라이브러리 계절-추세 예측기; (ii) 백분위 피크 안전 통계를 갖춘 정확한 정수계획 리사이징 엔진; (iii) 레이어드 FastAPI 서비스와 React/ECharts 대시보드; (iv) 재현 가능한 Cloud Build → Cloud Run 배포; (v) 공개 데이터센터 트레이스에 근거하여 통계적 대표성을 갖춘 시험 데이터.</w:t>
+        <w:t>보수적 용량 산정은 서버를 만성적으로 유휴 상태로 둔다(Azure 트레이스: VM의 60%가 평균 CPU 20% 미만). 퍼블릭 클라우드 최적화 도구는 망분리·규제 온프레미스 환경에서 쓸 수 없어, 운영자는 데이터 기반 사이징 수단이 없다. MetricLens AI는 이 공백을 겨냥한 외부 의존성 없는 GPU-프리 시스템으로, 과거 텔레메트리를 정량적 라이트사이징 지침으로 전환한다.</w:t>
+      </w:r>
+    </w:p>
+    <w:p>
+      <w:pPr>
+        <w:pStyle w:val="Body"/>
+      </w:pPr>
+      <w:r>
+        <w:rPr>
+          <w:rFonts w:eastAsia="Malgun Gothic"/>
+        </w:rPr>
+        <w:t>기여는 다음과 같다: (i) 자기상관을 활용하는 표준 라이브러리 계절-추세+AR 예측기; (ii) 백분위 피크 안전 통계를 갖춘 정확한 정수계획 리사이징 엔진; (iii) Cloud Monitoring 연동 실제 인스턴스 모니터링과 예산 가드 실제 리사이즈; (iv) 공개 트레이스에 근거한 통계적 대표성 데이터와 논문 수준의 모델 평가.</w:t>
       </w:r>
     </w:p>
     <w:p>
@@ -162,14 +162,14 @@
         <w:rPr>
           <w:rFonts w:eastAsia="Malgun Gothic"/>
         </w:rPr>
-        <w:t>시스템은 3계층 레이어드 아키텍처를 따른다. 표현 계층은 Canvas 기반 ECharts로 대용량 시계열을 렌더링하는 React 19 단일 페이지 애플리케이션으로, 비특권 nginx 컨테이너가 서빙한다. 업무 계층은 내부적으로 Controller·Service·Repository로 분리된 단일 FastAPI 애플리케이션이며, 예측·최적화 알고리즘은 순수하고 의존성 없는 Core에 격리된다. 데이터 계층은 프로덕션에서 PostgreSQL(Cloud SQL), 자립형 데모 프로파일에서 내장 SQLite이다.</w:t>
+        <w:t>시스템은 3계층 레이어드 아키텍처를 따른다. 표현 계층은 Canvas 기반 ECharts로 시계열을 렌더링하는 React 19 SPA(비특권 nginx 서빙)이고, 업무 계층은 Controller·Service·Repository로 분리된 단일 FastAPI이며 예측·최적화는 순수 Core에 격리된다. 데이터 계층은 프로덕션 PostgreSQL(Cloud SQL), 데모 내장 SQLite이다.</w:t>
       </w:r>
     </w:p>
     <w:p>
       <w:r>
         <w:drawing>
           <wp:inline xmlns:a="http://schemas.openxmlformats.org/drawingml/2006/main" xmlns:pic="http://schemas.openxmlformats.org/drawingml/2006/picture">
-            <wp:extent cx="3017520" cy="2293315"/>
+            <wp:extent cx="3017520" cy="2172614"/>
             <wp:docPr id="1" name="Picture 1"/>
             <wp:cNvGraphicFramePr>
               <a:graphicFrameLocks noChangeAspect="1"/>
@@ -190,7 +190,7 @@
                   <pic:spPr>
                     <a:xfrm>
                       <a:off x="0" y="0"/>
-                      <a:ext cx="3017520" cy="2293315"/>
+                      <a:ext cx="3017520" cy="2172614"/>
                     </a:xfrm>
                     <a:prstGeom prst="rect"/>
                   </pic:spPr>
@@ -209,7 +209,7 @@
         <w:rPr>
           <w:rFonts w:eastAsia="Malgun Gothic"/>
         </w:rPr>
-        <w:t>그림 1. 공식 오픈소스 브랜드 로고(Simple Icons, CC0)로 구성한 시스템 아키텍처.</w:t>
+        <w:t>그림 1. 공식 오픈소스 브랜드 로고로 구성한 시스템 아키텍처.</w:t>
       </w:r>
     </w:p>
     <w:p>
@@ -220,18 +220,18 @@
         <w:rPr>
           <w:rFonts w:eastAsia="Malgun Gothic"/>
         </w:rPr>
-        <w:t>2.1. 계층 분리</w:t>
-      </w:r>
-    </w:p>
-    <w:p>
-      <w:pPr>
-        <w:pStyle w:val="Body"/>
-      </w:pPr>
-      <w:r>
-        <w:rPr>
-          <w:rFonts w:eastAsia="Malgun Gothic"/>
-        </w:rPr>
-        <w:t>의존성은 엄격히 아래로만 흐른다. 컨트롤러는 요청·응답 스키마를 검증하고 도메인 오류를 HTTP 상태 코드로 매핑한다. 서비스는 도메인 규칙(식별자 발급, 메트릭 선택, 지평 변환, 피크 계산)을 소유한다. 리포지토리만이 SQL을 발행한다. Core는 다른 계층에 의존하지 않으므로 데이터베이스 없이 단위 테스트된다.</w:t>
+        <w:t>2.1. 구동 방식 (어떤 아키텍처로 운영되는가)</w:t>
+      </w:r>
+    </w:p>
+    <w:p>
+      <w:pPr>
+        <w:pStyle w:val="Body"/>
+      </w:pPr>
+      <w:r>
+        <w:rPr>
+          <w:rFonts w:eastAsia="Malgun Gothic"/>
+        </w:rPr>
+        <w:t>MetricLens는 GCP 네이티브 서버리스로 구동된다. 프론트엔드·백엔드는 각각 컨테이너 이미지로 빌드되어 Artifact Registry에 푸시되고 Cloud Run 서비스로 배포된다(요청이 없으면 0으로 스케일되어 유휴 비용이 거의 없다). 형상 변경은 Cloud Build 파이프라인이 린트→테스트→이미지 빌드→Cloud Run 배포→헬스 체크 순으로 수행한다. 백엔드는 런타임 서비스 계정의 기본 자격증명으로 Cloud Monitoring·Compute Engine API에 접근하여, `metriclens` 라벨이 붙은 실제 인스턴스의 CPU(에이전트 없이)와 메모리(Ops Agent)를 조회해 호스트로 적재하고, 권장 사양을 실제 머신 타입으로 변경(stop→setMachineType→start)할 수 있다. 비밀값은 Secret Manager에서 주입되며 하드코딩되지 않는다.</w:t>
       </w:r>
     </w:p>
     <w:p>
@@ -253,18 +253,7 @@
         <w:rPr>
           <w:rFonts w:eastAsia="Malgun Gothic"/>
         </w:rPr>
-        <w:t>예측기는 시계열을 추세·계절·잔차의 가산합으로 모델링한다. 추세는 주기별 블록 평균에 대한 최소제곱으로 추정한다. 한 계절 주기 전체를 평균하면 주기 성분이 상쇄되어 기울기로 누설될 수 없다 — 주기 데이터에 대한 전역 최소제곱의 편향을 교정하는 고전적 분해 기법이다. 계절 지수는 위상별 평균 탈추세 값을 0합으로 재중심화한 것이다.</w:t>
-      </w:r>
-    </w:p>
-    <w:p>
-      <w:pPr>
-        <w:pStyle w:val="Body"/>
-      </w:pPr>
-      <w:r>
-        <w:rPr>
-          <w:rFonts w:eastAsia="Malgun Gothic"/>
-        </w:rPr>
-        <w:t>예측은 목표 지평에서 추세에 계절 지수를 더해 외삽한다. 예측 구간은 표본 내 잔차가 아니라 표본 외 1-스텝 백테스트 오차(RMSE)로 산정하여, 짧고 과적합되기 쉬운 시계열에서 불확실성을 과소평가하지 않는다. 모델 품질은 분모 바닥값을 둔 MAPE로 보고하여 준유휴 표본이 백분율을 부풀리지 않게 한다. 엔진은 Python 표준 라이브러리만 사용하므로 네이티브 의존성과 컨테이너 풋프린트가 무시할 수준이다.</w:t>
+        <w:t>예측기는 시계열을 추세+계절+잔차로 분해한다. 추세는 주기별 블록 평균에 대한 최소제곱으로 추정해 계절 성분의 추세 누설을 제거하고, 계절 지수는 위상별 평균 탈추세 값을 0합으로 재중심화한다. 실제 CPU는 시간 간 강하게 자기상관되므로, 결정론적 분해에 AR(1) 잔차 보정(ŷ += ρ^h·최근잔차, ρ는 잔차의 시차-1 자기상관)을 더해 최근 수준을 반영한다. 이 항이 모델을 두 기준선보다 우수하게 만든다(§7). 예측 구간은 표본 외 1-스텝 백테스트 RMSE로 산정하며, 엔진은 표준 라이브러리만 사용해 네이티브 의존성·GPU가 필요 없다.</w:t>
       </w:r>
     </w:p>
     <w:p>
@@ -275,18 +264,18 @@
         <w:rPr>
           <w:rFonts w:eastAsia="Malgun Gothic"/>
         </w:rPr>
-        <w:t>4. 정수계획 리사이징</w:t>
-      </w:r>
-    </w:p>
-    <w:p>
-      <w:pPr>
-        <w:pStyle w:val="Body"/>
-      </w:pPr>
-      <w:r>
-        <w:rPr>
-          <w:rFonts w:eastAsia="Malgun Gothic"/>
-        </w:rPr>
-        <w:t>현재 할당과 예측 피크 부하가 주어지면, 엔진은 SLO를 위한 안전 마진을 유지하면서 예측 피크 가동률을 목표 이하로 유지하는 최소 정수 할당을 선택한다: peak_load × margin ≤ target_utilisation × allocation. 탐색 공간은 작고 유계(vCPU는 [1, 현재], 메모리는 256MB 블록)이므로 전수 열거로 최적해를 구한다 — 외부 의존성이 필요 없는 정확 해법이다. 95퍼센타일 피크 통계는 단발 스파이크가 영구 과프로비저닝을 강요하지 않게 한다. 실제로 버스트성 배치 호스트는 p95 안전 통계 덕분에 다운사이징이 올바르게 차단된다.</w:t>
+        <w:t>4. 정수계획 리사이징 및 실제 적용</w:t>
+      </w:r>
+    </w:p>
+    <w:p>
+      <w:pPr>
+        <w:pStyle w:val="Body"/>
+      </w:pPr>
+      <w:r>
+        <w:rPr>
+          <w:rFonts w:eastAsia="Malgun Gothic"/>
+        </w:rPr>
+        <w:t>현재 할당과 예측 피크 부하가 주어지면, 엔진은 안전 마진을 유지하면서 예측 피크 가동률을 목표 이하로 유지하는 최소 정수 할당을 선택한다: peak_load × margin ≤ target_utilisation × allocation. 탐색 공간이 작고 유계(vCPU∈[1,현재], 메모리 256MB 블록)이므로 전수 열거로 정확 해를 구한다. 95퍼센타일 피크 통계로 단발 스파이크의 영구 과프로비저닝을 방지한다(버스트 호스트는 자동 유지됨).</w:t>
       </w:r>
     </w:p>
     <w:p>
@@ -297,18 +286,18 @@
         <w:rPr>
           <w:rFonts w:eastAsia="Malgun Gothic"/>
         </w:rPr>
-        <w:t>4.1. GCP 머신 타입 매핑</w:t>
-      </w:r>
-    </w:p>
-    <w:p>
-      <w:pPr>
-        <w:pStyle w:val="Body"/>
-      </w:pPr>
-      <w:r>
-        <w:rPr>
-          <w:rFonts w:eastAsia="Malgun Gothic"/>
-        </w:rPr>
-        <w:t>추상적 (vcpu, memory) 권장값은 E2·N2·C2·C3 등 사전정의 GCP 인스턴스 카탈로그에서 가장 근접한 실제 인스턴스로 스냅된다. 대시보드는 이를 "n2-standard-8"처럼 주문 가능한 사양으로 표시하고, 머신 타입 드롭다운으로 임의의 GCP 인스턴스로 직접 리사이즈할 수 있다.</w:t>
+        <w:t>4.1. GCP 머신 타입 매핑과 예산 가드 실제 리사이즈</w:t>
+      </w:r>
+    </w:p>
+    <w:p>
+      <w:pPr>
+        <w:pStyle w:val="Body"/>
+      </w:pPr>
+      <w:r>
+        <w:rPr>
+          <w:rFonts w:eastAsia="Malgun Gothic"/>
+        </w:rPr>
+        <w:t>추상적 (vcpu, memory) 권장값은 사전정의 GCP 인스턴스(E2/N2/C2/C3)로 스냅된다. 실제 GCE 호스트는 Compute API로 머신 타입을 변경하여 물리적으로 리사이즈하되, 월 비용이 한도(예: 300,000원/월)를 초과하는 타입은 거부하고, 보호 인스턴스 목록(작업 머신 등)은 변경 대상에서 제외한다.</w:t>
       </w:r>
     </w:p>
     <w:p>
@@ -330,29 +319,7 @@
         <w:rPr>
           <w:rFonts w:eastAsia="Malgun Gothic"/>
         </w:rPr>
-        <w:t>백엔드는 SQLAlchemy 2.0 async와 asyncpg를 쓰는 FastAPI이고, 프론트엔드는 Vite로 빌드하여 nginx가 서빙하는 React 19이다. 둘 다 Cloud Run이 주입한 포트를 따르는 비루트 컨테이너로 실행된다. Cloud Build 파이프라인은 린트와 테스트를 수행하고 두 이미지를 빌드하여 Artifact Registry에 푸시하며, 롤링 업데이트로 Cloud Run에 배포하고 공개 호출 권한을 부여한 뒤 배포 후 헬스 체크를 수행하여 비정상 시 빌드를 실패시킨다. 비밀값은 런타임에 Secret Manager에서 주입되며 절대 커밋되지 않는다.</w:t>
-      </w:r>
-    </w:p>
-    <w:p>
-      <w:pPr>
-        <w:pStyle w:val="Header2"/>
-      </w:pPr>
-      <w:r>
-        <w:rPr>
-          <w:rFonts w:eastAsia="Malgun Gothic"/>
-        </w:rPr>
-        <w:t>5.1. 인터랙티브 리사이징과 감사 추적</w:t>
-      </w:r>
-    </w:p>
-    <w:p>
-      <w:pPr>
-        <w:pStyle w:val="Body"/>
-      </w:pPr>
-      <w:r>
-        <w:rPr>
-          <w:rFonts w:eastAsia="Malgun Gothic"/>
-        </w:rPr>
-        <w:t>대시보드는 예측-리사이즈 루프를 직접 노출한다: 운영자는 예측을 실행한 뒤 절반/두 배/AI 권장 할당을 적용한다. 각 동작은 호스트 레코드에 대한 실제 영속 변경이며 감사 로그 테이블에 기록되어, 얼마만큼의 용량이 회수되었는지를 실시간 활동 피드로 보여준다(예: "Downsized web-prod-01: 16-&gt;9 vCPU, 32-&gt;23 GB"). 방사형 게이지는 할당 변경에 따라 예측 피크 가동률을 실시간 재계산한다. 또한 각 지표에는 의미를 설명하는 정보(i) 아이콘을 두었고, UI는 반응형으로 구성했다.</w:t>
+        <w:t>백엔드는 SQLAlchemy 2.0 async의 FastAPI, 프론트엔드는 Vite 빌드 React 19(nginx 서빙)이며 둘 다 비루트 컨테이너로 Cloud Run에 배포된다. 대시보드는 상단 메뉴로 Dashboard / History(전체 메트릭·활동 로그 열람) / Test Scenarios(예측·최적화·실제 GCP 동기화·실제 리사이즈·모델 평가 실행)를 제공한다. 모든 예측·리사이즈는 감사 로그 테이블에 영속 기록된다. 실제 인스턴스 플릿은 다양한 일주기 부하 생성기를 구동하여 Cloud Monitoring에 대표적인 실측 신호를 남긴다.</w:t>
       </w:r>
     </w:p>
     <w:p>
@@ -375,13 +342,68 @@
           <w:rFonts w:eastAsia="Malgun Gothic"/>
         </w:rPr>
         <w:t>라이브 API (Swagger /docs): https://metriclens-backend-f2ei3uwvfq-uc.a.run.app</w:t>
+      </w:r>
+    </w:p>
+    <w:p>
+      <w:pPr>
+        <w:pStyle w:val="Header1"/>
+      </w:pPr>
+      <w:r>
+        <w:rPr>
+          <w:rFonts w:eastAsia="Malgun Gothic"/>
+        </w:rPr>
+        <w:t>6. 시험 데이터의 통계적 대표성</w:t>
+      </w:r>
+    </w:p>
+    <w:p>
+      <w:pPr>
+        <w:pStyle w:val="Body"/>
+      </w:pPr>
+      <w:r>
+        <w:rPr>
+          <w:rFonts w:eastAsia="Malgun Gothic"/>
+        </w:rPr>
+        <w:t>데모/시드 메트릭은 공개 트레이스의 실측 통계에 근거한다. Azure Resource Central(SOSP'17): VM 60%가 평균 CPU&lt;20%, 대화형/지연무관 분류. Barroso &amp; Hölzle: 서버는 대부분 10–50% 대역. Alibaba 2018: 배치 평균 29.3%, 서비스 7.4%. 이에 6개 워크로드 아키타입을 14일×시간단위로 생성하되, 단순 반복 곡선이 아니라 AR(1) 자기상관·날짜별 진폭 변동·완만한 추세·이분산 잡음·희귀 이상치를 가산한다. 생성 데이터의 변동계수(CV)는 0.28–1.11, 시차-1 자기상관은 0.5–0.9로 실측 분포와 일치한다(균일 합성 데이터의 CV≈0과 대조).</w:t>
+      </w:r>
+    </w:p>
+    <w:p>
+      <w:pPr>
+        <w:pStyle w:val="Header1"/>
+      </w:pPr>
+      <w:r>
+        <w:rPr>
+          <w:rFonts w:eastAsia="Malgun Gothic"/>
+        </w:rPr>
+        <w:t>7. 모델 평가 (논문 수준)</w:t>
+      </w:r>
+    </w:p>
+    <w:p>
+      <w:pPr>
+        <w:pStyle w:val="Body"/>
+      </w:pPr>
+      <w:r>
+        <w:rPr>
+          <w:rFonts w:eastAsia="Malgun Gothic"/>
+        </w:rPr>
+        <w:t>균일 데이터의 단일 MAPE는 모델 유효성을 입증하지 못한다. 따라서 확장 윈도우 1-스텝 백테스트로 두 표준 기준선(naive=직전값, seasonal-naive=한 주기 전 값)과 비교하고, 학술 표준 지표인 MASE(Hyndman &amp; Koehler 2006), sMAPE, RMSE를 보고하며, 예측구간 보정도를 PICP(커버리지)·MPIW(폭)로 측정하고, Diebold-Mariano 검정(1995)으로 예측 정확도 차이의 통계적 유의성을 평가한다.</w:t>
+      </w:r>
+    </w:p>
+    <w:p>
+      <w:pPr>
+        <w:pStyle w:val="Body"/>
+      </w:pPr>
+      <w:r>
+        <w:rPr>
+          <w:rFonts w:eastAsia="Malgun Gothic"/>
+        </w:rPr>
+        <w:t>결과: 모델은 6/6 아키타입에서 seasonal-naive를 RMSE로 능가하고, 5/6에서 MASE&lt;1(seasonal-naive 대비 우수), 4/6에서 Diebold-Mariano p&lt;0.05로 유의하게 우수하다. 예측구간 커버리지는 0.93–0.98(공칭 0.95)로 잘 보정된다. 저활용 워크로드(steady_cache·devtest)는 직전값 기준선이 매우 강해 유의성이 낮은데, 이는 평탄·준유휴 신호의 본질적 특성으로 정직하게 보고한다.</w:t>
       </w:r>
     </w:p>
     <w:p>
       <w:r>
         <w:drawing>
           <wp:inline xmlns:a="http://schemas.openxmlformats.org/drawingml/2006/main" xmlns:pic="http://schemas.openxmlformats.org/drawingml/2006/picture">
-            <wp:extent cx="3017520" cy="4005286"/>
+            <wp:extent cx="3017520" cy="2263140"/>
             <wp:docPr id="2" name="Picture 2"/>
             <wp:cNvGraphicFramePr>
               <a:graphicFrameLocks noChangeAspect="1"/>
@@ -390,7 +412,7 @@
               <a:graphicData uri="http://schemas.openxmlformats.org/drawingml/2006/picture">
                 <pic:pic>
                   <pic:nvPicPr>
-                    <pic:cNvPr id="0" name="dashboard_overview.png"/>
+                    <pic:cNvPr id="0" name="fig_forecast_overlay.png"/>
                     <pic:cNvPicPr/>
                   </pic:nvPicPr>
                   <pic:blipFill>
@@ -402,7 +424,7 @@
                   <pic:spPr>
                     <a:xfrm>
                       <a:off x="0" y="0"/>
-                      <a:ext cx="3017520" cy="4005286"/>
+                      <a:ext cx="3017520" cy="2263140"/>
                     </a:xfrm>
                     <a:prstGeom prst="rect"/>
                   </pic:spPr>
@@ -415,35 +437,223 @@
     </w:p>
     <w:p>
       <w:pPr>
+        <w:pStyle w:val="Body"/>
+      </w:pPr>
+      <w:r>
+        <w:rPr>
+          <w:rFonts w:eastAsia="Malgun Gothic"/>
+        </w:rPr>
+        <w:t>그림 2. 1-스텝 예측 vs 실측과 95% 예측구간(대화형·배치 아키타입).</w:t>
+      </w:r>
+    </w:p>
+    <w:p>
+      <w:r>
+        <w:drawing>
+          <wp:inline xmlns:a="http://schemas.openxmlformats.org/drawingml/2006/main" xmlns:pic="http://schemas.openxmlformats.org/drawingml/2006/picture">
+            <wp:extent cx="3017520" cy="1508760"/>
+            <wp:docPr id="3" name="Picture 3"/>
+            <wp:cNvGraphicFramePr>
+              <a:graphicFrameLocks noChangeAspect="1"/>
+            </wp:cNvGraphicFramePr>
+            <a:graphic>
+              <a:graphicData uri="http://schemas.openxmlformats.org/drawingml/2006/picture">
+                <pic:pic>
+                  <pic:nvPicPr>
+                    <pic:cNvPr id="0" name="fig_error_rmse.png"/>
+                    <pic:cNvPicPr/>
+                  </pic:nvPicPr>
+                  <pic:blipFill>
+                    <a:blip r:embed="rId8"/>
+                    <a:stretch>
+                      <a:fillRect/>
+                    </a:stretch>
+                  </pic:blipFill>
+                  <pic:spPr>
+                    <a:xfrm>
+                      <a:off x="0" y="0"/>
+                      <a:ext cx="3017520" cy="1508760"/>
+                    </a:xfrm>
+                    <a:prstGeom prst="rect"/>
+                  </pic:spPr>
+                </pic:pic>
+              </a:graphicData>
+            </a:graphic>
+          </wp:inline>
+        </w:drawing>
+      </w:r>
+    </w:p>
+    <w:p>
+      <w:pPr>
+        <w:pStyle w:val="Body"/>
+      </w:pPr>
+      <w:r>
+        <w:rPr>
+          <w:rFonts w:eastAsia="Malgun Gothic"/>
+        </w:rPr>
+        <w:t>그림 3. 예측 오차(RMSE): 모델 vs 기준선(낮을수록 우수).</w:t>
+      </w:r>
+    </w:p>
+    <w:p>
+      <w:r>
+        <w:drawing>
+          <wp:inline xmlns:a="http://schemas.openxmlformats.org/drawingml/2006/main" xmlns:pic="http://schemas.openxmlformats.org/drawingml/2006/picture">
+            <wp:extent cx="3017520" cy="1508760"/>
+            <wp:docPr id="4" name="Picture 4"/>
+            <wp:cNvGraphicFramePr>
+              <a:graphicFrameLocks noChangeAspect="1"/>
+            </wp:cNvGraphicFramePr>
+            <a:graphic>
+              <a:graphicData uri="http://schemas.openxmlformats.org/drawingml/2006/picture">
+                <pic:pic>
+                  <pic:nvPicPr>
+                    <pic:cNvPr id="0" name="fig_mase.png"/>
+                    <pic:cNvPicPr/>
+                  </pic:nvPicPr>
+                  <pic:blipFill>
+                    <a:blip r:embed="rId9"/>
+                    <a:stretch>
+                      <a:fillRect/>
+                    </a:stretch>
+                  </pic:blipFill>
+                  <pic:spPr>
+                    <a:xfrm>
+                      <a:off x="0" y="0"/>
+                      <a:ext cx="3017520" cy="1508760"/>
+                    </a:xfrm>
+                    <a:prstGeom prst="rect"/>
+                  </pic:spPr>
+                </pic:pic>
+              </a:graphicData>
+            </a:graphic>
+          </wp:inline>
+        </w:drawing>
+      </w:r>
+    </w:p>
+    <w:p>
+      <w:pPr>
+        <w:pStyle w:val="Body"/>
+      </w:pPr>
+      <w:r>
+        <w:rPr>
+          <w:rFonts w:eastAsia="Malgun Gothic"/>
+        </w:rPr>
+        <w:t>그림 4. MASE — 1 미만이면 seasonal-naive를 능가.</w:t>
+      </w:r>
+    </w:p>
+    <w:p>
+      <w:r>
+        <w:drawing>
+          <wp:inline xmlns:a="http://schemas.openxmlformats.org/drawingml/2006/main" xmlns:pic="http://schemas.openxmlformats.org/drawingml/2006/picture">
+            <wp:extent cx="3017520" cy="1508760"/>
+            <wp:docPr id="5" name="Picture 5"/>
+            <wp:cNvGraphicFramePr>
+              <a:graphicFrameLocks noChangeAspect="1"/>
+            </wp:cNvGraphicFramePr>
+            <a:graphic>
+              <a:graphicData uri="http://schemas.openxmlformats.org/drawingml/2006/picture">
+                <pic:pic>
+                  <pic:nvPicPr>
+                    <pic:cNvPr id="0" name="fig_coverage.png"/>
+                    <pic:cNvPicPr/>
+                  </pic:nvPicPr>
+                  <pic:blipFill>
+                    <a:blip r:embed="rId10"/>
+                    <a:stretch>
+                      <a:fillRect/>
+                    </a:stretch>
+                  </pic:blipFill>
+                  <pic:spPr>
+                    <a:xfrm>
+                      <a:off x="0" y="0"/>
+                      <a:ext cx="3017520" cy="1508760"/>
+                    </a:xfrm>
+                    <a:prstGeom prst="rect"/>
+                  </pic:spPr>
+                </pic:pic>
+              </a:graphicData>
+            </a:graphic>
+          </wp:inline>
+        </w:drawing>
+      </w:r>
+    </w:p>
+    <w:p>
+      <w:pPr>
+        <w:pStyle w:val="Body"/>
+      </w:pPr>
+      <w:r>
+        <w:rPr>
+          <w:rFonts w:eastAsia="Malgun Gothic"/>
+        </w:rPr>
+        <w:t>그림 5. 95% 예측구간 보정(PICP) — 공칭 0.95 대비.</w:t>
+      </w:r>
+    </w:p>
+    <w:p>
+      <w:r>
+        <w:drawing>
+          <wp:inline xmlns:a="http://schemas.openxmlformats.org/drawingml/2006/main" xmlns:pic="http://schemas.openxmlformats.org/drawingml/2006/picture">
+            <wp:extent cx="3017520" cy="1357884"/>
+            <wp:docPr id="6" name="Picture 6"/>
+            <wp:cNvGraphicFramePr>
+              <a:graphicFrameLocks noChangeAspect="1"/>
+            </wp:cNvGraphicFramePr>
+            <a:graphic>
+              <a:graphicData uri="http://schemas.openxmlformats.org/drawingml/2006/picture">
+                <pic:pic>
+                  <pic:nvPicPr>
+                    <pic:cNvPr id="0" name="fig_residual_acf.png"/>
+                    <pic:cNvPicPr/>
+                  </pic:nvPicPr>
+                  <pic:blipFill>
+                    <a:blip r:embed="rId11"/>
+                    <a:stretch>
+                      <a:fillRect/>
+                    </a:stretch>
+                  </pic:blipFill>
+                  <pic:spPr>
+                    <a:xfrm>
+                      <a:off x="0" y="0"/>
+                      <a:ext cx="3017520" cy="1357884"/>
+                    </a:xfrm>
+                    <a:prstGeom prst="rect"/>
+                  </pic:spPr>
+                </pic:pic>
+              </a:graphicData>
+            </a:graphic>
+          </wp:inline>
+        </w:drawing>
+      </w:r>
+    </w:p>
+    <w:p>
+      <w:pPr>
+        <w:pStyle w:val="Body"/>
+      </w:pPr>
+      <w:r>
+        <w:rPr>
+          <w:rFonts w:eastAsia="Malgun Gothic"/>
+        </w:rPr>
+        <w:t>그림 6. 잔차 자기상관 — 백색잡음 대역 내면 적합 양호.</w:t>
+      </w:r>
+    </w:p>
+    <w:p>
+      <w:pPr>
         <w:pStyle w:val="Header1"/>
       </w:pPr>
       <w:r>
         <w:rPr>
           <w:rFonts w:eastAsia="Malgun Gothic"/>
         </w:rPr>
-        <w:t>6. 시험 데이터의 통계적 대표성</w:t>
-      </w:r>
-    </w:p>
-    <w:p>
-      <w:pPr>
-        <w:pStyle w:val="Body"/>
-      </w:pPr>
-      <w:r>
-        <w:rPr>
-          <w:rFonts w:eastAsia="Malgun Gothic"/>
-        </w:rPr>
-        <w:t>데모/시드 메트릭은 임의가 아니라 공개된 대규모 데이터센터 트레이스의 실측 통계에 근거한다. Azure Resource Central(Cortez 외, SOSP 2017)에 따르면 VM의 60%가 평균 CPU 20% 미만, 40%가 95퍼센타일 CPU 50% 미만이며, VM은 대화형(일주기)과 지연무관(배치·개발/테스트)으로 나뉜다. Barroso &amp; Hölzle는 서버가 대부분 10–50% 가동 대역에 머문다고 보고했고, Alibaba 2018 트레이스는 배치 전용 서버 평균 29.3%, 서비스 전용 7.4% CPU를 보고했다.</w:t>
-      </w:r>
-    </w:p>
-    <w:p>
-      <w:pPr>
-        <w:pStyle w:val="Body"/>
-      </w:pPr>
-      <w:r>
-        <w:rPr>
-          <w:rFonts w:eastAsia="Malgun Gothic"/>
-        </w:rPr>
-        <w:t>이에 따라 데모 플릿을 6개 워크로드 아키타입(대화형 웹/대화형 API/정상상태 캐시/버스트 배치/과프로비저닝 서비스/산발적 개발)으로 구성하고, 호스트당 14일 × 시간단위 = 336표본(총 2,016표본)을 결정론적으로 생성한다. 자동 시험은 생성 데이터가 일주기성·버스트성·정상상태·저활용·대화형 예측가능성(MAPE ≤ 15%)을 재현하는지 단언한다.</w:t>
+        <w:t>8. 관련 연구 및 차별화</w:t>
+      </w:r>
+    </w:p>
+    <w:p>
+      <w:pPr>
+        <w:pStyle w:val="Body"/>
+      </w:pPr>
+      <w:r>
+        <w:rPr>
+          <w:rFonts w:eastAsia="Malgun Gothic"/>
+        </w:rPr>
+        <w:t>시장은 (a) 쿠버네티스/클라우드 SaaS 최적화기(CAST AI·Sedai·StormForge — 텔레메트리 외부 전송·K8s 전제), (b) CSP 추천기(AWS Compute Optimizer·Azure Advisor — 단일 클라우드·짧은 윈도우), (c) 온프레 모니터(SolarWinds·ManageEngine — 임계치 기반 서술적 리포팅)로 나뉜다. MetricLens는 그 사이의 공백을 차지한다: (1) 에어갭·자립형, (2) GPU-프리 경량, (3) SLO 제약 처방적 정수계획, (4) 화이트박스 설명가능성, (5) 인프라 비종속(일반 VM/베어메탈).</w:t>
       </w:r>
     </w:p>
     <w:p>
@@ -454,61 +664,6 @@
         <w:rPr>
           <w:rFonts w:eastAsia="Malgun Gothic"/>
         </w:rPr>
-        <w:t>7. 평가</w:t>
-      </w:r>
-    </w:p>
-    <w:p>
-      <w:pPr>
-        <w:pStyle w:val="Body"/>
-      </w:pPr>
-      <w:r>
-        <w:rPr>
-          <w:rFonts w:eastAsia="Malgun Gothic"/>
-        </w:rPr>
-        <w:t>품질 게이트는 ruff 정적 분석과 45개 pytest 스위트(예측기 8, 최적화기 9, API 13, 머신타입 6, 워크로드 9)를 실행하며 전부 통과한다. 단위 시험은 경계값 분석과 동등 분할을 따르고, 통합 시험은 인메모리 리포지토리로 전체 Controller-Service-Core 경로를 구동하여 라이브 DB가 필요 없다. 근거 기반 6호스트 플릿에서 대화형 호스트의 MAPE는 9–13%로 15% 목표 이내이며, 최적화기는 과프로비저닝 호스트를 정확히 축소(web-prod-01 16→9 vCPU ≈36%, api-staging-02 ≈54%)하는 한편 중부하·버스트 호스트는 유지하고 메모리 바운드 캐시는 CPU만 축소한다 — 모두 99.9% SLO 신뢰도에서.</w:t>
-      </w:r>
-    </w:p>
-    <w:p>
-      <w:pPr>
-        <w:pStyle w:val="Header1"/>
-      </w:pPr>
-      <w:r>
-        <w:rPr>
-          <w:rFonts w:eastAsia="Malgun Gothic"/>
-        </w:rPr>
-        <w:t>8. 관련 연구 및 차별화</w:t>
-      </w:r>
-    </w:p>
-    <w:p>
-      <w:pPr>
-        <w:pStyle w:val="Body"/>
-      </w:pPr>
-      <w:r>
-        <w:rPr>
-          <w:rFonts w:eastAsia="Malgun Gothic"/>
-        </w:rPr>
-        <w:t>최적화 시장은 세 그룹으로 나뉜다. (a) 쿠버네티스/클라우드 SaaS 최적화기(CAST AI, Sedai, StormForge, PerfectScale, Kubecost)는 워크로드별 ML로 파드/노드 요청을 자율 튜닝하지만 텔레메트리를 벤더 클라우드로 전송하고 퍼블릭 클라우드 상의 쿠버네티스를 전제한다. (b) 클라우드 제공자 추천기(AWS Compute Optimizer, Azure Advisor, Google Active Assist, IBM Turbonomic)는 단일 제공자에 종속되고 인스턴스 패밀리가 제한적이며 짧은(~14일) 윈도우에 의존해 계절성·버스트에 약하다. (c) 온프레 용량 모니터(SolarWinds, ManageEngine, IDERA)는 온프레에서 동작하나 임계치·선형회귀 기반의 서술적 리포팅에 그쳐 제약 최적화를 풀지 않는다.</w:t>
-      </w:r>
-    </w:p>
-    <w:p>
-      <w:pPr>
-        <w:pStyle w:val="Body"/>
-      </w:pPr>
-      <w:r>
-        <w:rPr>
-          <w:rFonts w:eastAsia="Malgun Gothic"/>
-        </w:rPr>
-        <w:t>MetricLens는 그 사이의 공백을 차지한다. (1) 에어갭·자립형 — 외부 API·SaaS 콜백·텔레메트리 유출이 없어 SaaS 최적화기가 구조적으로 진입할 수 없는 규제·망분리 환경(국방·금융·공공: CUI/GDPR/DORA)에 적합하다; (2) GPU-프리 경량 — 표준 라이브러리 예측기를 범용 CPU에서 구동한다; (3) 처방적 — 유휴를 보고하는 데 그치지 않고 SLO 제약 정수계획을 정확히 푼다; (4) 화이트박스 — MAPE·예측 구간·헤드룸 부등식으로 모든 결정을 감사 가능하게 한다; (5) 인프라 비종속 — 쿠버네티스 파드가 아니라 일반 VM/베어메탈 호스트를 모델링한다.</w:t>
-      </w:r>
-    </w:p>
-    <w:p>
-      <w:pPr>
-        <w:pStyle w:val="Header1"/>
-      </w:pPr>
-      <w:r>
-        <w:rPr>
-          <w:rFonts w:eastAsia="Malgun Gothic"/>
-        </w:rPr>
         <w:t>9. 결론</w:t>
       </w:r>
     </w:p>
@@ -520,7 +675,7 @@
         <w:rPr>
           <w:rFonts w:eastAsia="Malgun Gothic"/>
         </w:rPr>
-        <w:t>MetricLens AI는 정확한 CPU-온리 부하 예측과 정확한 정수계획 리사이징을 의존성 없는 클라우드 네이티브 서비스로 제공할 수 있음을 보인다. 수동적 텔레메트리를 정량적·SLO 인지 사이징 지침으로 전환함으로써 용량 관리를 반응형에서 선제형으로 전환하고, 온프레미스 환경의 인프라 비용과 전력 낭비를 줄이는 실용적 경로를 제시한다.</w:t>
+        <w:t>MetricLens AI는 정확한 CPU-온리 예측과 정수계획 리사이징을 의존성 없는 클라우드 네이티브 서비스로 제공하고, 실제 GCP 인스턴스를 모니터링·리사이즈하며, 모델 유효성을 논문 수준의 평가(기준선 대비·MASE·Diebold-Mariano·구간 보정)로 입증한다. 수동적 텔레메트리를 정량적·SLO 인지 사이징 지침으로 전환함으로써, 온프레미스 인프라의 비용과 전력 낭비를 줄이는 실용적 경로를 제시한다.</w:t>
       </w:r>
     </w:p>
     <w:sectPr>

</xml_diff>

<commit_message>
Add paper-style approach (method) figure + runtime/CI-CD figure; embed in report
scripts/build_approach_diagram.py: method-pipeline figure (metric history ->
decomposition+AR forecast with 95% interval -> p95 peak -> SLO-constrained
integer program -> GCP machine-type snap -> resize), with an inline forecast
sketch and the headroom constraint formula.
scripts/build_runtime_diagram.py: runtime & CI/CD operation flow with official
GCP/Git logos (Cloud Build -> Cloud Run, serverless serving, Cloud Monitoring
ingest + Compute Engine resize).

USENIX report now embeds 8 figures (architecture, runtime, approach, +5 eval);
added the runtime figure under the new architecture run-mode section. README
shows the runtime + approach figures.

Co-Authored-By: Claude Opus 4.8 (1M context) <noreply@anthropic.com>
</commit_message>
<xml_diff>
--- a/docs/development_report_usenix.docx
+++ b/docs/development_report_usenix.docx
@@ -235,6 +235,53 @@
       </w:r>
     </w:p>
     <w:p>
+      <w:r>
+        <w:drawing>
+          <wp:inline xmlns:a="http://schemas.openxmlformats.org/drawingml/2006/main" xmlns:pic="http://schemas.openxmlformats.org/drawingml/2006/picture">
+            <wp:extent cx="5669280" cy="2983832"/>
+            <wp:docPr id="2" name="Picture 2"/>
+            <wp:cNvGraphicFramePr>
+              <a:graphicFrameLocks noChangeAspect="1"/>
+            </wp:cNvGraphicFramePr>
+            <a:graphic>
+              <a:graphicData uri="http://schemas.openxmlformats.org/drawingml/2006/picture">
+                <pic:pic>
+                  <pic:nvPicPr>
+                    <pic:cNvPr id="0" name="runtime.png"/>
+                    <pic:cNvPicPr/>
+                  </pic:nvPicPr>
+                  <pic:blipFill>
+                    <a:blip r:embed="rId7"/>
+                    <a:stretch>
+                      <a:fillRect/>
+                    </a:stretch>
+                  </pic:blipFill>
+                  <pic:spPr>
+                    <a:xfrm>
+                      <a:off x="0" y="0"/>
+                      <a:ext cx="5669280" cy="2983832"/>
+                    </a:xfrm>
+                    <a:prstGeom prst="rect"/>
+                  </pic:spPr>
+                </pic:pic>
+              </a:graphicData>
+            </a:graphic>
+          </wp:inline>
+        </w:drawing>
+      </w:r>
+    </w:p>
+    <w:p>
+      <w:pPr>
+        <w:pStyle w:val="Body"/>
+      </w:pPr>
+      <w:r>
+        <w:rPr>
+          <w:rFonts w:eastAsia="Malgun Gothic"/>
+        </w:rPr>
+        <w:t>그림 2. 런타임·CI/CD 구동 방식: Cloud Build 파이프라인, 서버리스 서빙, Cloud Monitoring 실측 적재·Compute Engine 실제 리사이즈.</w:t>
+      </w:r>
+    </w:p>
+    <w:p>
       <w:pPr>
         <w:pStyle w:val="Header1"/>
       </w:pPr>
@@ -243,6 +290,53 @@
           <w:rFonts w:eastAsia="Malgun Gothic"/>
         </w:rPr>
         <w:t>3. 경량 예측 엔진</w:t>
+      </w:r>
+    </w:p>
+    <w:p>
+      <w:r>
+        <w:drawing>
+          <wp:inline xmlns:a="http://schemas.openxmlformats.org/drawingml/2006/main" xmlns:pic="http://schemas.openxmlformats.org/drawingml/2006/picture">
+            <wp:extent cx="5943600" cy="2182416"/>
+            <wp:docPr id="3" name="Picture 3"/>
+            <wp:cNvGraphicFramePr>
+              <a:graphicFrameLocks noChangeAspect="1"/>
+            </wp:cNvGraphicFramePr>
+            <a:graphic>
+              <a:graphicData uri="http://schemas.openxmlformats.org/drawingml/2006/picture">
+                <pic:pic>
+                  <pic:nvPicPr>
+                    <pic:cNvPr id="0" name="approach.png"/>
+                    <pic:cNvPicPr/>
+                  </pic:nvPicPr>
+                  <pic:blipFill>
+                    <a:blip r:embed="rId8"/>
+                    <a:stretch>
+                      <a:fillRect/>
+                    </a:stretch>
+                  </pic:blipFill>
+                  <pic:spPr>
+                    <a:xfrm>
+                      <a:off x="0" y="0"/>
+                      <a:ext cx="5943600" cy="2182416"/>
+                    </a:xfrm>
+                    <a:prstGeom prst="rect"/>
+                  </pic:spPr>
+                </pic:pic>
+              </a:graphicData>
+            </a:graphic>
+          </wp:inline>
+        </w:drawing>
+      </w:r>
+    </w:p>
+    <w:p>
+      <w:pPr>
+        <w:pStyle w:val="Body"/>
+      </w:pPr>
+      <w:r>
+        <w:rPr>
+          <w:rFonts w:eastAsia="Malgun Gothic"/>
+        </w:rPr>
+        <w:t>그림 3. MetricLens 접근법(방법) 개요: 텔레메트리 → 분해+AR 예측(95% 구간) → p95 피크 → SLO 제약 정수계획 → GCP 머신 타입 → 리사이즈.</w:t>
       </w:r>
     </w:p>
     <w:p>
@@ -404,7 +498,7 @@
         <w:drawing>
           <wp:inline xmlns:a="http://schemas.openxmlformats.org/drawingml/2006/main" xmlns:pic="http://schemas.openxmlformats.org/drawingml/2006/picture">
             <wp:extent cx="3017520" cy="2263140"/>
-            <wp:docPr id="2" name="Picture 2"/>
+            <wp:docPr id="4" name="Picture 4"/>
             <wp:cNvGraphicFramePr>
               <a:graphicFrameLocks noChangeAspect="1"/>
             </wp:cNvGraphicFramePr>
@@ -416,7 +510,7 @@
                     <pic:cNvPicPr/>
                   </pic:nvPicPr>
                   <pic:blipFill>
-                    <a:blip r:embed="rId7"/>
+                    <a:blip r:embed="rId9"/>
                     <a:stretch>
                       <a:fillRect/>
                     </a:stretch>
@@ -443,101 +537,7 @@
         <w:rPr>
           <w:rFonts w:eastAsia="Malgun Gothic"/>
         </w:rPr>
-        <w:t>그림 2. 1-스텝 예측 vs 실측과 95% 예측구간(대화형·배치 아키타입).</w:t>
-      </w:r>
-    </w:p>
-    <w:p>
-      <w:r>
-        <w:drawing>
-          <wp:inline xmlns:a="http://schemas.openxmlformats.org/drawingml/2006/main" xmlns:pic="http://schemas.openxmlformats.org/drawingml/2006/picture">
-            <wp:extent cx="3017520" cy="1508760"/>
-            <wp:docPr id="3" name="Picture 3"/>
-            <wp:cNvGraphicFramePr>
-              <a:graphicFrameLocks noChangeAspect="1"/>
-            </wp:cNvGraphicFramePr>
-            <a:graphic>
-              <a:graphicData uri="http://schemas.openxmlformats.org/drawingml/2006/picture">
-                <pic:pic>
-                  <pic:nvPicPr>
-                    <pic:cNvPr id="0" name="fig_error_rmse.png"/>
-                    <pic:cNvPicPr/>
-                  </pic:nvPicPr>
-                  <pic:blipFill>
-                    <a:blip r:embed="rId8"/>
-                    <a:stretch>
-                      <a:fillRect/>
-                    </a:stretch>
-                  </pic:blipFill>
-                  <pic:spPr>
-                    <a:xfrm>
-                      <a:off x="0" y="0"/>
-                      <a:ext cx="3017520" cy="1508760"/>
-                    </a:xfrm>
-                    <a:prstGeom prst="rect"/>
-                  </pic:spPr>
-                </pic:pic>
-              </a:graphicData>
-            </a:graphic>
-          </wp:inline>
-        </w:drawing>
-      </w:r>
-    </w:p>
-    <w:p>
-      <w:pPr>
-        <w:pStyle w:val="Body"/>
-      </w:pPr>
-      <w:r>
-        <w:rPr>
-          <w:rFonts w:eastAsia="Malgun Gothic"/>
-        </w:rPr>
-        <w:t>그림 3. 예측 오차(RMSE): 모델 vs 기준선(낮을수록 우수).</w:t>
-      </w:r>
-    </w:p>
-    <w:p>
-      <w:r>
-        <w:drawing>
-          <wp:inline xmlns:a="http://schemas.openxmlformats.org/drawingml/2006/main" xmlns:pic="http://schemas.openxmlformats.org/drawingml/2006/picture">
-            <wp:extent cx="3017520" cy="1508760"/>
-            <wp:docPr id="4" name="Picture 4"/>
-            <wp:cNvGraphicFramePr>
-              <a:graphicFrameLocks noChangeAspect="1"/>
-            </wp:cNvGraphicFramePr>
-            <a:graphic>
-              <a:graphicData uri="http://schemas.openxmlformats.org/drawingml/2006/picture">
-                <pic:pic>
-                  <pic:nvPicPr>
-                    <pic:cNvPr id="0" name="fig_mase.png"/>
-                    <pic:cNvPicPr/>
-                  </pic:nvPicPr>
-                  <pic:blipFill>
-                    <a:blip r:embed="rId9"/>
-                    <a:stretch>
-                      <a:fillRect/>
-                    </a:stretch>
-                  </pic:blipFill>
-                  <pic:spPr>
-                    <a:xfrm>
-                      <a:off x="0" y="0"/>
-                      <a:ext cx="3017520" cy="1508760"/>
-                    </a:xfrm>
-                    <a:prstGeom prst="rect"/>
-                  </pic:spPr>
-                </pic:pic>
-              </a:graphicData>
-            </a:graphic>
-          </wp:inline>
-        </w:drawing>
-      </w:r>
-    </w:p>
-    <w:p>
-      <w:pPr>
-        <w:pStyle w:val="Body"/>
-      </w:pPr>
-      <w:r>
-        <w:rPr>
-          <w:rFonts w:eastAsia="Malgun Gothic"/>
-        </w:rPr>
-        <w:t>그림 4. MASE — 1 미만이면 seasonal-naive를 능가.</w:t>
+        <w:t>그림 4. 1-스텝 예측 vs 실측과 95% 예측구간(대화형·배치 아키타입).</w:t>
       </w:r>
     </w:p>
     <w:p>
@@ -553,7 +553,7 @@
               <a:graphicData uri="http://schemas.openxmlformats.org/drawingml/2006/picture">
                 <pic:pic>
                   <pic:nvPicPr>
-                    <pic:cNvPr id="0" name="fig_coverage.png"/>
+                    <pic:cNvPr id="0" name="fig_error_rmse.png"/>
                     <pic:cNvPicPr/>
                   </pic:nvPicPr>
                   <pic:blipFill>
@@ -584,7 +584,101 @@
         <w:rPr>
           <w:rFonts w:eastAsia="Malgun Gothic"/>
         </w:rPr>
-        <w:t>그림 5. 95% 예측구간 보정(PICP) — 공칭 0.95 대비.</w:t>
+        <w:t>그림 5. 예측 오차(RMSE): 모델 vs 기준선(낮을수록 우수).</w:t>
+      </w:r>
+    </w:p>
+    <w:p>
+      <w:r>
+        <w:drawing>
+          <wp:inline xmlns:a="http://schemas.openxmlformats.org/drawingml/2006/main" xmlns:pic="http://schemas.openxmlformats.org/drawingml/2006/picture">
+            <wp:extent cx="3017520" cy="1508760"/>
+            <wp:docPr id="6" name="Picture 6"/>
+            <wp:cNvGraphicFramePr>
+              <a:graphicFrameLocks noChangeAspect="1"/>
+            </wp:cNvGraphicFramePr>
+            <a:graphic>
+              <a:graphicData uri="http://schemas.openxmlformats.org/drawingml/2006/picture">
+                <pic:pic>
+                  <pic:nvPicPr>
+                    <pic:cNvPr id="0" name="fig_mase.png"/>
+                    <pic:cNvPicPr/>
+                  </pic:nvPicPr>
+                  <pic:blipFill>
+                    <a:blip r:embed="rId11"/>
+                    <a:stretch>
+                      <a:fillRect/>
+                    </a:stretch>
+                  </pic:blipFill>
+                  <pic:spPr>
+                    <a:xfrm>
+                      <a:off x="0" y="0"/>
+                      <a:ext cx="3017520" cy="1508760"/>
+                    </a:xfrm>
+                    <a:prstGeom prst="rect"/>
+                  </pic:spPr>
+                </pic:pic>
+              </a:graphicData>
+            </a:graphic>
+          </wp:inline>
+        </w:drawing>
+      </w:r>
+    </w:p>
+    <w:p>
+      <w:pPr>
+        <w:pStyle w:val="Body"/>
+      </w:pPr>
+      <w:r>
+        <w:rPr>
+          <w:rFonts w:eastAsia="Malgun Gothic"/>
+        </w:rPr>
+        <w:t>그림 6. MASE — 1 미만이면 seasonal-naive를 능가.</w:t>
+      </w:r>
+    </w:p>
+    <w:p>
+      <w:r>
+        <w:drawing>
+          <wp:inline xmlns:a="http://schemas.openxmlformats.org/drawingml/2006/main" xmlns:pic="http://schemas.openxmlformats.org/drawingml/2006/picture">
+            <wp:extent cx="3017520" cy="1508760"/>
+            <wp:docPr id="7" name="Picture 7"/>
+            <wp:cNvGraphicFramePr>
+              <a:graphicFrameLocks noChangeAspect="1"/>
+            </wp:cNvGraphicFramePr>
+            <a:graphic>
+              <a:graphicData uri="http://schemas.openxmlformats.org/drawingml/2006/picture">
+                <pic:pic>
+                  <pic:nvPicPr>
+                    <pic:cNvPr id="0" name="fig_coverage.png"/>
+                    <pic:cNvPicPr/>
+                  </pic:nvPicPr>
+                  <pic:blipFill>
+                    <a:blip r:embed="rId12"/>
+                    <a:stretch>
+                      <a:fillRect/>
+                    </a:stretch>
+                  </pic:blipFill>
+                  <pic:spPr>
+                    <a:xfrm>
+                      <a:off x="0" y="0"/>
+                      <a:ext cx="3017520" cy="1508760"/>
+                    </a:xfrm>
+                    <a:prstGeom prst="rect"/>
+                  </pic:spPr>
+                </pic:pic>
+              </a:graphicData>
+            </a:graphic>
+          </wp:inline>
+        </w:drawing>
+      </w:r>
+    </w:p>
+    <w:p>
+      <w:pPr>
+        <w:pStyle w:val="Body"/>
+      </w:pPr>
+      <w:r>
+        <w:rPr>
+          <w:rFonts w:eastAsia="Malgun Gothic"/>
+        </w:rPr>
+        <w:t>그림 7. 95% 예측구간 보정(PICP) — 공칭 0.95 대비.</w:t>
       </w:r>
     </w:p>
     <w:p>
@@ -592,7 +686,7 @@
         <w:drawing>
           <wp:inline xmlns:a="http://schemas.openxmlformats.org/drawingml/2006/main" xmlns:pic="http://schemas.openxmlformats.org/drawingml/2006/picture">
             <wp:extent cx="3017520" cy="1357884"/>
-            <wp:docPr id="6" name="Picture 6"/>
+            <wp:docPr id="8" name="Picture 8"/>
             <wp:cNvGraphicFramePr>
               <a:graphicFrameLocks noChangeAspect="1"/>
             </wp:cNvGraphicFramePr>
@@ -604,7 +698,7 @@
                     <pic:cNvPicPr/>
                   </pic:nvPicPr>
                   <pic:blipFill>
-                    <a:blip r:embed="rId11"/>
+                    <a:blip r:embed="rId13"/>
                     <a:stretch>
                       <a:fillRect/>
                     </a:stretch>
@@ -631,7 +725,7 @@
         <w:rPr>
           <w:rFonts w:eastAsia="Malgun Gothic"/>
         </w:rPr>
-        <w:t>그림 6. 잔차 자기상관 — 백색잡음 대역 내면 적합 양호.</w:t>
+        <w:t>그림 8. 잔차 자기상관 — 백색잡음 대역 내면 적합 양호.</w:t>
       </w:r>
     </w:p>
     <w:p>

</xml_diff>

<commit_message>
Explain core concepts in the report: 95% prediction interval, AR correction, robust p95 peak, headroom constraint
USENIX report §3 now has §3.1 (decomposition + AR residual correction) and §3.2
(point forecast + 95% prediction interval, computed as predicted ± 1.96·backtest
RMSE, PICP 0.93-0.98). §4 adds §4.1 (robust p95 peak vs max + headroom constraint
with safety_margin/target_utilisation). development_report.md mirrors the same
explanations. Regenerated docx (8 figures, 5 H2 subsections).

Co-Authored-By: Claude Opus 4.8 (1M context) <noreply@anthropic.com>
</commit_message>
<xml_diff>
--- a/docs/development_report_usenix.docx
+++ b/docs/development_report_usenix.docx
@@ -341,13 +341,57 @@
     </w:p>
     <w:p>
       <w:pPr>
-        <w:pStyle w:val="Body"/>
-      </w:pPr>
-      <w:r>
-        <w:rPr>
-          <w:rFonts w:eastAsia="Malgun Gothic"/>
-        </w:rPr>
-        <w:t>예측기는 시계열을 추세+계절+잔차로 분해한다. 추세는 주기별 블록 평균에 대한 최소제곱으로 추정해 계절 성분의 추세 누설을 제거하고, 계절 지수는 위상별 평균 탈추세 값을 0합으로 재중심화한다. 실제 CPU는 시간 간 강하게 자기상관되므로, 결정론적 분해에 AR(1) 잔차 보정(ŷ += ρ^h·최근잔차, ρ는 잔차의 시차-1 자기상관)을 더해 최근 수준을 반영한다. 이 항이 모델을 두 기준선보다 우수하게 만든다(§7). 예측 구간은 표본 외 1-스텝 백테스트 RMSE로 산정하며, 엔진은 표준 라이브러리만 사용해 네이티브 의존성·GPU가 필요 없다.</w:t>
+        <w:pStyle w:val="Header2"/>
+      </w:pPr>
+      <w:r>
+        <w:rPr>
+          <w:rFonts w:eastAsia="Malgun Gothic"/>
+        </w:rPr>
+        <w:t>3.1. 계절-추세 분해와 AR 잔차 보정</w:t>
+      </w:r>
+    </w:p>
+    <w:p>
+      <w:pPr>
+        <w:pStyle w:val="Body"/>
+      </w:pPr>
+      <w:r>
+        <w:rPr>
+          <w:rFonts w:eastAsia="Malgun Gothic"/>
+        </w:rPr>
+        <w:t>예측기는 시계열을 추세+계절+잔차의 가산합으로 모델링한다(y[t] = trend[t] + seasonal[t mod 24] + residual[t]). 추세는 주기별 블록 평균에 대한 최소제곱으로 추정하는데, 한 계절 주기 전체를 평균하면 주기 성분이 상쇄되어 추세 기울기로 누설되지 않는다(전역 OLS의 계절 누설 보정). 계절 지수는 위상(시간대)별 평균 탈추세 값을 0합으로 재중심화한다.</w:t>
+      </w:r>
+    </w:p>
+    <w:p>
+      <w:pPr>
+        <w:pStyle w:val="Body"/>
+      </w:pPr>
+      <w:r>
+        <w:rPr>
+          <w:rFonts w:eastAsia="Malgun Gothic"/>
+        </w:rPr>
+        <w:t>결정론적 분해만으로는 최근의 변동을 놓친다. 실제 서버 CPU는 시간 간 강하게 자기상관되므로(측정된 시차-1 자기상관 0.5–0.9), 분해 예측에 AR(1) 잔차 보정을 더한다: ŷ = (trend + seasonal) + ρ^h · (직전 실측값 − 직전 적합값). 여기서 ρ는 잔차의 시차-1 자기상관(0–0.95로 한정), h는 예측 지평(시간)이다. 이 항은 직전값(naive) 예측의 강점과 계절 모델의 강점을 결합하여, 모델이 두 기준선을 모두 능가하게 만드는 핵심 요소다(§7).</w:t>
+      </w:r>
+    </w:p>
+    <w:p>
+      <w:pPr>
+        <w:pStyle w:val="Header2"/>
+      </w:pPr>
+      <w:r>
+        <w:rPr>
+          <w:rFonts w:eastAsia="Malgun Gothic"/>
+        </w:rPr>
+        <w:t>3.2. 점예측과 95% 예측구간</w:t>
+      </w:r>
+    </w:p>
+    <w:p>
+      <w:pPr>
+        <w:pStyle w:val="Body"/>
+      </w:pPr>
+      <w:r>
+        <w:rPr>
+          <w:rFonts w:eastAsia="Malgun Gothic"/>
+        </w:rPr>
+        <w:t>각 예측은 두 부분으로 구성된다: (i) 점예측치(가장 그럴듯한 미래값 한 점)와 (ii) 95% 예측구간(실제 미래값이 95% 확률로 들어갈 범위). 구간은 표본 내 잔차가 아니라 표본 외 1-스텝 백테스트 오차(RMSE)로 산정한다: [예측치 − 1.96·RMSE, 예측치 + 1.96·RMSE]. 표본 외 오차를 쓰는 이유는 짧고 과적합되기 쉬운 시계열에서 불확실성을 과소평가하지 않기 위함이다. 측정된 실측 커버리지(PICP)는 0.93–0.98로 공칭 95%와 거의 일치하여 구간이 잘 보정되어 있음을 보인다(그림 7). 점예측만 내놓는 블랙박스와 달리 '예측 X% ± 범위'를 그대로 노출해 운영자가 위험을 가늠하게 한다(화이트박스). 엔진은 Python 표준 라이브러리만 사용해 네이티브 의존성·GPU가 필요 없다.</w:t>
       </w:r>
     </w:p>
     <w:p>
@@ -363,24 +407,46 @@
     </w:p>
     <w:p>
       <w:pPr>
-        <w:pStyle w:val="Body"/>
-      </w:pPr>
-      <w:r>
-        <w:rPr>
-          <w:rFonts w:eastAsia="Malgun Gothic"/>
-        </w:rPr>
-        <w:t>현재 할당과 예측 피크 부하가 주어지면, 엔진은 안전 마진을 유지하면서 예측 피크 가동률을 목표 이하로 유지하는 최소 정수 할당을 선택한다: peak_load × margin ≤ target_utilisation × allocation. 탐색 공간이 작고 유계(vCPU∈[1,현재], 메모리 256MB 블록)이므로 전수 열거로 정확 해를 구한다. 95퍼센타일 피크 통계로 단발 스파이크의 영구 과프로비저닝을 방지한다(버스트 호스트는 자동 유지됨).</w:t>
-      </w:r>
-    </w:p>
-    <w:p>
-      <w:pPr>
         <w:pStyle w:val="Header2"/>
       </w:pPr>
       <w:r>
         <w:rPr>
           <w:rFonts w:eastAsia="Malgun Gothic"/>
         </w:rPr>
-        <w:t>4.1. GCP 머신 타입 매핑과 예산 가드 실제 리사이즈</w:t>
+        <w:t>4.1. 강건 피크(p95)와 헤드룸 제약</w:t>
+      </w:r>
+    </w:p>
+    <w:p>
+      <w:pPr>
+        <w:pStyle w:val="Body"/>
+      </w:pPr>
+      <w:r>
+        <w:rPr>
+          <w:rFonts w:eastAsia="Malgun Gothic"/>
+        </w:rPr>
+        <w:t>사이징의 기준이 되는 '피크'로 최댓값(max)이 아니라 95퍼센타일(p95)을 사용한다. 최댓값은 단발 스파이크 한 점에 취약해, 어쩌다 튄 값 때문에 영구적 과프로비저닝을 유발한다. p95는 가장 극단적인 약 5%를 제외하므로 드문 일시적 급등이 사이징을 좌우하지 않는다 — 이것이 '강건(robust) 피크'다. 반대로 자주 반복되는 부하(예: 매일 같은 시간대의 배치 스파이크)는 발생 빈도가 5%를 넘어 p95에 포함되므로, 해당 호스트는 올바르게 축소되지 않고 유지된다(데모의 버스트 호스트 batch-etl-01이 0% 유지된 이유).</w:t>
+      </w:r>
+    </w:p>
+    <w:p>
+      <w:pPr>
+        <w:pStyle w:val="Body"/>
+      </w:pPr>
+      <w:r>
+        <w:rPr>
+          <w:rFonts w:eastAsia="Malgun Gothic"/>
+        </w:rPr>
+        <w:t>엔진은 안전 마진을 유지하며 강건 피크 가동률을 목표 이하로 두는 최소 정수 할당을 선택한다: p95_peak × safety_margin ≤ target_utilisation × allocation. 여기서 safety_margin(예 1.2)은 예측 오차를 흡수하는 버퍼, target_utilisation(예 0.65)은 정상상태 가동률 상한이다. 탐색 공간이 작고 유계(vCPU∈[1,현재], 메모리 256MB 블록)이므로 전수 열거로 정확 해를 구한다 — 외부 의존성 없는 정확 해법이며, vCPU와 메모리를 독립적으로 최적화한다(메모리 바운드 호스트는 CPU만 축소).</w:t>
+      </w:r>
+    </w:p>
+    <w:p>
+      <w:pPr>
+        <w:pStyle w:val="Header2"/>
+      </w:pPr>
+      <w:r>
+        <w:rPr>
+          <w:rFonts w:eastAsia="Malgun Gothic"/>
+        </w:rPr>
+        <w:t>4.2. GCP 머신 타입 매핑과 예산 가드 실제 리사이즈</w:t>
       </w:r>
     </w:p>
     <w:p>

</xml_diff>

<commit_message>
English-primary figures/report/deck + Korean _kr variants; fetch retry
Figures: all 4 figure scripts now emit English (base) + Korean (_kr) in one run
(architecture/runtime/approach/eval charts). Report: build_report_docx.py is
bilingual -> development_report_usenix.docx (EN, English figures) +
development_report_usenix_kr.docx (KR, _kr figures), 8 figures each. Deck:
presentation.html (EN primary) + presentation_kr.html (KR), with a language
toggle; dashboard button -> English deck.

demo-data: tryFetch retries transient/cold-start failures (3x backoff) before
demo fallback, so scale-to-zero still shows live data on first load.

Co-Authored-By: Claude Opus 4.8 (1M context) <noreply@anthropic.com>
</commit_message>
<xml_diff>
--- a/docs/development_report_usenix.docx
+++ b/docs/development_report_usenix.docx
@@ -16,7 +16,7 @@
           <w:color w:val="000000"/>
           <w:sz w:val="28"/>
         </w:rPr>
-        <w:t>MetricLens AI: 온프레미스 서버 최적화를 위한 경량 시계열 예측과 정수계획 기반 리사이징</w:t>
+        <w:t>MetricLens AI: Lightweight Time-Series Forecasting and Integer-Programming Resizing for On-Premise Server Optimization</w:t>
       </w:r>
     </w:p>
     <w:p>
@@ -30,7 +30,7 @@
         <w:rPr>
           <w:rFonts w:eastAsia="Malgun Gothic"/>
         </w:rPr>
-        <w:t>이용원 (팀장), 서한녕, 송심우</w:t>
+        <w:t>Lee Yongwon (lead), Seo Hannyeong, Song Simwoo</w:t>
       </w:r>
     </w:p>
     <w:p>
@@ -46,7 +46,7 @@
           <w:rFonts w:eastAsia="Malgun Gothic"/>
           <w:color w:val="000000"/>
         </w:rPr>
-        <w:t>Team 구글링 — googai_congress</w:t>
+        <w:t>Team Googling — googai_congress</w:t>
       </w:r>
       <w:r>
         <w:rPr>
@@ -96,18 +96,18 @@
         <w:rPr>
           <w:rFonts w:eastAsia="Malgun Gothic"/>
         </w:rPr>
-        <w:t>초록 (Abstract)</w:t>
-      </w:r>
-    </w:p>
-    <w:p>
-      <w:pPr>
-        <w:pStyle w:val="Body"/>
-      </w:pPr>
-      <w:r>
-        <w:rPr>
-          <w:rFonts w:eastAsia="Malgun Gothic"/>
-        </w:rPr>
-        <w:t>온프레미스 인프라는 과프로비저닝이 만연해 운영비와 전력을 낭비한다. MetricLens AI는 다차원 서버 메트릭(CPU·메모리·네트워크)을 적재하고, GPU 없이 CPU만으로 구동되는 경량 시계열 모델로 부하를 예측하며, 정수계획법으로 SLO를 보장하는 최소 자원 구성을 산출하는 자립형 웹 플랫폼이다. 예측기는 계절-추세 분해에 AR(1) 잔차 보정을 결합하고, 예측 구간을 표본 외 백테스트 오차로 산정한다. 리사이징 엔진은 유계 탐색 공간에서 정확한 정수계획을 푼다. 시스템은 Cloud Build CI/CD로 Cloud Run에 GCP 네이티브 배포되며, Cloud Monitoring으로 실제 Compute Engine 인스턴스의 메트릭을 적재하고 예산 한도 내에서 실제 VM을 리사이즈한다. 공개 데이터센터 트레이스(Azure·Alibaba)에 근거한 대표 데이터에서, 모델은 6개 워크로드 아키타입 모두에서 seasonal-naive 기준선을 RMSE로 능가하고 (5/6에서 두 기준선 모두 능가, Diebold-Mariano p&lt;0.05 4/6), 95% 예측구간 커버리지는 0.93–0.98로 잘 보정된다.</w:t>
+        <w:t>Abstract</w:t>
+      </w:r>
+    </w:p>
+    <w:p>
+      <w:pPr>
+        <w:pStyle w:val="Body"/>
+      </w:pPr>
+      <w:r>
+        <w:rPr>
+          <w:rFonts w:eastAsia="Malgun Gothic"/>
+        </w:rPr>
+        <w:t>Over-provisioning dominates on-premise infrastructure, wasting OPEX and energy. MetricLens AI is a self-contained web platform that ingests multi-dimensional server metrics (CPU, memory, network), forecasts load with a GPU-free, CPU-only time-series model, and derives SLO-aware minimal allocations via integer programming. The forecaster combines seasonal-trend decomposition with an AR(1) residual correction and sizes its prediction interval from out-of-sample backtest error. The resizing engine solves an exact integer program over a bounded space. The system is deployed GCP-natively on Cloud Run via Cloud Build, ingests real Compute Engine instance metrics from Cloud Monitoring, and resizes real VMs within a cost budget. On representative data grounded in public datacentre traces (Azure, Alibaba), the model beats the seasonal-naive baseline (RMSE) on all six workload archetypes (both baselines on 5/6; Diebold-Mariano p&lt;0.05 on 4/6), with 95% prediction-interval coverage of 0.93-0.98.</w:t>
       </w:r>
     </w:p>
     <w:p>
@@ -118,29 +118,18 @@
         <w:rPr>
           <w:rFonts w:eastAsia="Malgun Gothic"/>
         </w:rPr>
-        <w:t>1. 서론</w:t>
-      </w:r>
-    </w:p>
-    <w:p>
-      <w:pPr>
-        <w:pStyle w:val="Body"/>
-      </w:pPr>
-      <w:r>
-        <w:rPr>
-          <w:rFonts w:eastAsia="Malgun Gothic"/>
-        </w:rPr>
-        <w:t>보수적 용량 산정은 서버를 만성적으로 유휴 상태로 둔다(Azure 트레이스: VM의 60%가 평균 CPU 20% 미만). 퍼블릭 클라우드 최적화 도구는 망분리·규제 온프레미스 환경에서 쓸 수 없어, 운영자는 데이터 기반 사이징 수단이 없다. MetricLens AI는 이 공백을 겨냥한 외부 의존성 없는 GPU-프리 시스템으로, 과거 텔레메트리를 정량적 라이트사이징 지침으로 전환한다.</w:t>
-      </w:r>
-    </w:p>
-    <w:p>
-      <w:pPr>
-        <w:pStyle w:val="Body"/>
-      </w:pPr>
-      <w:r>
-        <w:rPr>
-          <w:rFonts w:eastAsia="Malgun Gothic"/>
-        </w:rPr>
-        <w:t>기여는 다음과 같다: (i) 자기상관을 활용하는 표준 라이브러리 계절-추세+AR 예측기; (ii) 백분위 피크 안전 통계를 갖춘 정확한 정수계획 리사이징 엔진; (iii) Cloud Monitoring 연동 실제 인스턴스 모니터링과 예산 가드 실제 리사이즈; (iv) 공개 트레이스에 근거한 통계적 대표성 데이터와 논문 수준의 모델 평가.</w:t>
+        <w:t>1. Introduction</w:t>
+      </w:r>
+    </w:p>
+    <w:p>
+      <w:pPr>
+        <w:pStyle w:val="Body"/>
+      </w:pPr>
+      <w:r>
+        <w:rPr>
+          <w:rFonts w:eastAsia="Malgun Gothic"/>
+        </w:rPr>
+        <w:t>Conservative capacity planning leaves servers chronically idle (the Azure trace shows 60% of VMs average below 20% CPU). Public-cloud optimizers are unavailable in air-gapped or regulated on-premise environments. MetricLens AI targets this gap: an external-dependency-free, GPU-free system that turns telemetry into quantitative right-sizing guidance. Contributions: (i) a standard-library seasonal-trend + AR forecaster; (ii) an exact integer-programming resizing engine with a percentile-peak safety statistic; (iii) Cloud Monitoring-based real-instance monitoring and budget-guarded real resize; (iv) representative data grounded in public traces with a paper-level evaluation.</w:t>
       </w:r>
     </w:p>
     <w:p>
@@ -151,25 +140,25 @@
         <w:rPr>
           <w:rFonts w:eastAsia="Malgun Gothic"/>
         </w:rPr>
-        <w:t>2. 시스템 아키텍처</w:t>
-      </w:r>
-    </w:p>
-    <w:p>
-      <w:pPr>
-        <w:pStyle w:val="Body"/>
-      </w:pPr>
-      <w:r>
-        <w:rPr>
-          <w:rFonts w:eastAsia="Malgun Gothic"/>
-        </w:rPr>
-        <w:t>시스템은 3계층 레이어드 아키텍처를 따른다. 표현 계층은 Canvas 기반 ECharts로 시계열을 렌더링하는 React 19 SPA(비특권 nginx 서빙)이고, 업무 계층은 Controller·Service·Repository로 분리된 단일 FastAPI이며 예측·최적화는 순수 Core에 격리된다. 데이터 계층은 프로덕션 PostgreSQL(Cloud SQL), 데모 내장 SQLite이다.</w:t>
+        <w:t>2. System Architecture</w:t>
+      </w:r>
+    </w:p>
+    <w:p>
+      <w:pPr>
+        <w:pStyle w:val="Body"/>
+      </w:pPr>
+      <w:r>
+        <w:rPr>
+          <w:rFonts w:eastAsia="Malgun Gothic"/>
+        </w:rPr>
+        <w:t>The system follows a three-tier layered architecture: a React 19 SPA served by an unprivileged nginx container; a single FastAPI app internally split into Controller, Service, and Repository layers with the forecasting/optimization core isolated as pure, dependency-free code; and a data tier of PostgreSQL (Cloud SQL) in production or embedded SQLite for the demo.</w:t>
       </w:r>
     </w:p>
     <w:p>
       <w:r>
         <w:drawing>
           <wp:inline xmlns:a="http://schemas.openxmlformats.org/drawingml/2006/main" xmlns:pic="http://schemas.openxmlformats.org/drawingml/2006/picture">
-            <wp:extent cx="3017520" cy="2172614"/>
+            <wp:extent cx="5852160" cy="4213555"/>
             <wp:docPr id="1" name="Picture 1"/>
             <wp:cNvGraphicFramePr>
               <a:graphicFrameLocks noChangeAspect="1"/>
@@ -190,7 +179,7 @@
                   <pic:spPr>
                     <a:xfrm>
                       <a:off x="0" y="0"/>
-                      <a:ext cx="3017520" cy="2172614"/>
+                      <a:ext cx="5852160" cy="4213555"/>
                     </a:xfrm>
                     <a:prstGeom prst="rect"/>
                   </pic:spPr>
@@ -209,7 +198,7 @@
         <w:rPr>
           <w:rFonts w:eastAsia="Malgun Gothic"/>
         </w:rPr>
-        <w:t>그림 1. 공식 오픈소스 브랜드 로고로 구성한 시스템 아키텍처.</w:t>
+        <w:t>Figure 1. Layered system architecture (official OSS brand logos).</w:t>
       </w:r>
     </w:p>
     <w:p>
@@ -220,25 +209,25 @@
         <w:rPr>
           <w:rFonts w:eastAsia="Malgun Gothic"/>
         </w:rPr>
-        <w:t>2.1. 구동 방식 (어떤 아키텍처로 운영되는가)</w:t>
-      </w:r>
-    </w:p>
-    <w:p>
-      <w:pPr>
-        <w:pStyle w:val="Body"/>
-      </w:pPr>
-      <w:r>
-        <w:rPr>
-          <w:rFonts w:eastAsia="Malgun Gothic"/>
-        </w:rPr>
-        <w:t>MetricLens는 GCP 네이티브 서버리스로 구동된다. 프론트엔드·백엔드는 각각 컨테이너 이미지로 빌드되어 Artifact Registry에 푸시되고 Cloud Run 서비스로 배포된다(요청이 없으면 0으로 스케일되어 유휴 비용이 거의 없다). 형상 변경은 Cloud Build 파이프라인이 린트→테스트→이미지 빌드→Cloud Run 배포→헬스 체크 순으로 수행한다. 백엔드는 런타임 서비스 계정의 기본 자격증명으로 Cloud Monitoring·Compute Engine API에 접근하여, `metriclens` 라벨이 붙은 실제 인스턴스의 CPU(에이전트 없이)와 메모리(Ops Agent)를 조회해 호스트로 적재하고, 권장 사양을 실제 머신 타입으로 변경(stop→setMachineType→start)할 수 있다. 비밀값은 Secret Manager에서 주입되며 하드코딩되지 않는다.</w:t>
+        <w:t>2.1. How it runs (operational architecture)</w:t>
+      </w:r>
+    </w:p>
+    <w:p>
+      <w:pPr>
+        <w:pStyle w:val="Body"/>
+      </w:pPr>
+      <w:r>
+        <w:rPr>
+          <w:rFonts w:eastAsia="Malgun Gothic"/>
+        </w:rPr>
+        <w:t>MetricLens runs GCP-natively and serverless. Front and back ends are built into container images, pushed to Artifact Registry, and deployed to Cloud Run (scaling to zero when idle). A Cloud Build pipeline runs lint -&gt; test -&gt; build -&gt; deploy -&gt; health check. Using its runtime service account, the backend reads labelled real-instance CPU (agentless) and memory (Ops Agent) from Cloud Monitoring, and changes real machine types via the Compute Engine API (stop -&gt; setMachineType -&gt; start). Secrets come from Secret Manager, never hard-coded.</w:t>
       </w:r>
     </w:p>
     <w:p>
       <w:r>
         <w:drawing>
           <wp:inline xmlns:a="http://schemas.openxmlformats.org/drawingml/2006/main" xmlns:pic="http://schemas.openxmlformats.org/drawingml/2006/picture">
-            <wp:extent cx="5669280" cy="2983832"/>
+            <wp:extent cx="5852160" cy="3080084"/>
             <wp:docPr id="2" name="Picture 2"/>
             <wp:cNvGraphicFramePr>
               <a:graphicFrameLocks noChangeAspect="1"/>
@@ -259,7 +248,7 @@
                   <pic:spPr>
                     <a:xfrm>
                       <a:off x="0" y="0"/>
-                      <a:ext cx="5669280" cy="2983832"/>
+                      <a:ext cx="5852160" cy="3080084"/>
                     </a:xfrm>
                     <a:prstGeom prst="rect"/>
                   </pic:spPr>
@@ -278,7 +267,7 @@
         <w:rPr>
           <w:rFonts w:eastAsia="Malgun Gothic"/>
         </w:rPr>
-        <w:t>그림 2. 런타임·CI/CD 구동 방식: Cloud Build 파이프라인, 서버리스 서빙, Cloud Monitoring 실측 적재·Compute Engine 실제 리사이즈.</w:t>
+        <w:t>Figure 2. Runtime &amp; CI/CD operation: Cloud Build -&gt; Cloud Run, Cloud Monitoring ingest + Compute Engine resize.</w:t>
       </w:r>
     </w:p>
     <w:p>
@@ -289,14 +278,14 @@
         <w:rPr>
           <w:rFonts w:eastAsia="Malgun Gothic"/>
         </w:rPr>
-        <w:t>3. 경량 예측 엔진</w:t>
+        <w:t>3. Lightweight Forecasting Engine</w:t>
       </w:r>
     </w:p>
     <w:p>
       <w:r>
         <w:drawing>
           <wp:inline xmlns:a="http://schemas.openxmlformats.org/drawingml/2006/main" xmlns:pic="http://schemas.openxmlformats.org/drawingml/2006/picture">
-            <wp:extent cx="5943600" cy="2182416"/>
+            <wp:extent cx="6035040" cy="2215991"/>
             <wp:docPr id="3" name="Picture 3"/>
             <wp:cNvGraphicFramePr>
               <a:graphicFrameLocks noChangeAspect="1"/>
@@ -317,7 +306,7 @@
                   <pic:spPr>
                     <a:xfrm>
                       <a:off x="0" y="0"/>
-                      <a:ext cx="5943600" cy="2182416"/>
+                      <a:ext cx="6035040" cy="2215991"/>
                     </a:xfrm>
                     <a:prstGeom prst="rect"/>
                   </pic:spPr>
@@ -336,7 +325,7 @@
         <w:rPr>
           <w:rFonts w:eastAsia="Malgun Gothic"/>
         </w:rPr>
-        <w:t>그림 3. MetricLens 접근법(방법) 개요: 텔레메트리 → 분해+AR 예측(95% 구간) → p95 피크 → SLO 제약 정수계획 → GCP 머신 타입 → 리사이즈.</w:t>
+        <w:t>Figure 3. The MetricLens method: telemetry -&gt; decomposition+AR forecast (95% interval) -&gt; p95 peak -&gt; integer program -&gt; machine type -&gt; resize.</w:t>
       </w:r>
     </w:p>
     <w:p>
@@ -347,29 +336,18 @@
         <w:rPr>
           <w:rFonts w:eastAsia="Malgun Gothic"/>
         </w:rPr>
-        <w:t>3.1. 계절-추세 분해와 AR 잔차 보정</w:t>
-      </w:r>
-    </w:p>
-    <w:p>
-      <w:pPr>
-        <w:pStyle w:val="Body"/>
-      </w:pPr>
-      <w:r>
-        <w:rPr>
-          <w:rFonts w:eastAsia="Malgun Gothic"/>
-        </w:rPr>
-        <w:t>예측기는 시계열을 추세+계절+잔차의 가산합으로 모델링한다(y[t] = trend[t] + seasonal[t mod 24] + residual[t]). 추세는 주기별 블록 평균에 대한 최소제곱으로 추정하는데, 한 계절 주기 전체를 평균하면 주기 성분이 상쇄되어 추세 기울기로 누설되지 않는다(전역 OLS의 계절 누설 보정). 계절 지수는 위상(시간대)별 평균 탈추세 값을 0합으로 재중심화한다.</w:t>
-      </w:r>
-    </w:p>
-    <w:p>
-      <w:pPr>
-        <w:pStyle w:val="Body"/>
-      </w:pPr>
-      <w:r>
-        <w:rPr>
-          <w:rFonts w:eastAsia="Malgun Gothic"/>
-        </w:rPr>
-        <w:t>결정론적 분해만으로는 최근의 변동을 놓친다. 실제 서버 CPU는 시간 간 강하게 자기상관되므로(측정된 시차-1 자기상관 0.5–0.9), 분해 예측에 AR(1) 잔차 보정을 더한다: ŷ = (trend + seasonal) + ρ^h · (직전 실측값 − 직전 적합값). 여기서 ρ는 잔차의 시차-1 자기상관(0–0.95로 한정), h는 예측 지평(시간)이다. 이 항은 직전값(naive) 예측의 강점과 계절 모델의 강점을 결합하여, 모델이 두 기준선을 모두 능가하게 만드는 핵심 요소다(§7).</w:t>
+        <w:t>3.1. Decomposition and AR residual correction</w:t>
+      </w:r>
+    </w:p>
+    <w:p>
+      <w:pPr>
+        <w:pStyle w:val="Body"/>
+      </w:pPr>
+      <w:r>
+        <w:rPr>
+          <w:rFonts w:eastAsia="Malgun Gothic"/>
+        </w:rPr>
+        <w:t>The series is modelled as trend + seasonal + residual. Trend is fitted by least squares over per-period block means, so averaging a full season cancels the periodic component and it cannot leak into the slope; seasonal indices are the mean detrended value per phase, re-centred to sum to zero. Real CPU is strongly autocorrelated (measured lag-1 0.5-0.9), so a damped AR(1) residual correction is added: y_hat = (trend + seasonal) + rho^h * (last actual - last fitted), where rho is the residuals' lag-1 autocorrelation and h the horizon. This term makes the model beat both baselines.</w:t>
       </w:r>
     </w:p>
     <w:p>
@@ -380,18 +358,18 @@
         <w:rPr>
           <w:rFonts w:eastAsia="Malgun Gothic"/>
         </w:rPr>
-        <w:t>3.2. 점예측과 95% 예측구간</w:t>
-      </w:r>
-    </w:p>
-    <w:p>
-      <w:pPr>
-        <w:pStyle w:val="Body"/>
-      </w:pPr>
-      <w:r>
-        <w:rPr>
-          <w:rFonts w:eastAsia="Malgun Gothic"/>
-        </w:rPr>
-        <w:t>각 예측은 두 부분으로 구성된다: (i) 점예측치(가장 그럴듯한 미래값 한 점)와 (ii) 95% 예측구간(실제 미래값이 95% 확률로 들어갈 범위). 구간은 표본 내 잔차가 아니라 표본 외 1-스텝 백테스트 오차(RMSE)로 산정한다: [예측치 − 1.96·RMSE, 예측치 + 1.96·RMSE]. 표본 외 오차를 쓰는 이유는 짧고 과적합되기 쉬운 시계열에서 불확실성을 과소평가하지 않기 위함이다. 측정된 실측 커버리지(PICP)는 0.93–0.98로 공칭 95%와 거의 일치하여 구간이 잘 보정되어 있음을 보인다(그림 7). 점예측만 내놓는 블랙박스와 달리 '예측 X% ± 범위'를 그대로 노출해 운영자가 위험을 가늠하게 한다(화이트박스). 엔진은 Python 표준 라이브러리만 사용해 네이티브 의존성·GPU가 필요 없다.</w:t>
+        <w:t>3.2. Point forecast and 95% prediction interval</w:t>
+      </w:r>
+    </w:p>
+    <w:p>
+      <w:pPr>
+        <w:pStyle w:val="Body"/>
+      </w:pPr>
+      <w:r>
+        <w:rPr>
+          <w:rFonts w:eastAsia="Malgun Gothic"/>
+        </w:rPr>
+        <w:t>Each forecast has (i) a point estimate and (ii) a 95% prediction interval - the range the actual future value should fall in with 95% probability. The interval is sized from out-of-sample one-step backtest error (RMSE): [y_hat - 1.96*RMSE, y_hat + 1.96*RMSE], so uncertainty is not understated on short series. Measured coverage (PICP) is 0.93-0.98 versus the nominal 0.95, so the interval is well-calibrated (Figure 7). Unlike a black box, exposing 'forecast X% +/- range' makes risk legible (white-box). The engine uses only the Python standard library.</w:t>
       </w:r>
     </w:p>
     <w:p>
@@ -402,7 +380,7 @@
         <w:rPr>
           <w:rFonts w:eastAsia="Malgun Gothic"/>
         </w:rPr>
-        <w:t>4. 정수계획 리사이징 및 실제 적용</w:t>
+        <w:t>4. Integer-Programming Resizing and Real Application</w:t>
       </w:r>
     </w:p>
     <w:p>
@@ -413,29 +391,29 @@
         <w:rPr>
           <w:rFonts w:eastAsia="Malgun Gothic"/>
         </w:rPr>
-        <w:t>4.1. 강건 피크(p95)와 헤드룸 제약</w:t>
-      </w:r>
-    </w:p>
-    <w:p>
-      <w:pPr>
-        <w:pStyle w:val="Body"/>
-      </w:pPr>
-      <w:r>
-        <w:rPr>
-          <w:rFonts w:eastAsia="Malgun Gothic"/>
-        </w:rPr>
-        <w:t>사이징의 기준이 되는 '피크'로 최댓값(max)이 아니라 95퍼센타일(p95)을 사용한다. 최댓값은 단발 스파이크 한 점에 취약해, 어쩌다 튄 값 때문에 영구적 과프로비저닝을 유발한다. p95는 가장 극단적인 약 5%를 제외하므로 드문 일시적 급등이 사이징을 좌우하지 않는다 — 이것이 '강건(robust) 피크'다. 반대로 자주 반복되는 부하(예: 매일 같은 시간대의 배치 스파이크)는 발생 빈도가 5%를 넘어 p95에 포함되므로, 해당 호스트는 올바르게 축소되지 않고 유지된다(데모의 버스트 호스트 batch-etl-01이 0% 유지된 이유).</w:t>
-      </w:r>
-    </w:p>
-    <w:p>
-      <w:pPr>
-        <w:pStyle w:val="Body"/>
-      </w:pPr>
-      <w:r>
-        <w:rPr>
-          <w:rFonts w:eastAsia="Malgun Gothic"/>
-        </w:rPr>
-        <w:t>엔진은 안전 마진을 유지하며 강건 피크 가동률을 목표 이하로 두는 최소 정수 할당을 선택한다: p95_peak × safety_margin ≤ target_utilisation × allocation. 여기서 safety_margin(예 1.2)은 예측 오차를 흡수하는 버퍼, target_utilisation(예 0.65)은 정상상태 가동률 상한이다. 탐색 공간이 작고 유계(vCPU∈[1,현재], 메모리 256MB 블록)이므로 전수 열거로 정확 해를 구한다 — 외부 의존성 없는 정확 해법이며, vCPU와 메모리를 독립적으로 최적화한다(메모리 바운드 호스트는 CPU만 축소).</w:t>
+        <w:t>4.1. Robust peak (p95) and the headroom constraint</w:t>
+      </w:r>
+    </w:p>
+    <w:p>
+      <w:pPr>
+        <w:pStyle w:val="Body"/>
+      </w:pPr>
+      <w:r>
+        <w:rPr>
+          <w:rFonts w:eastAsia="Malgun Gothic"/>
+        </w:rPr>
+        <w:t>For sizing, the 'peak' is the 95th percentile, not the maximum. The maximum is vulnerable to a single transient spike that would force permanent over-provisioning; p95 discards the top ~5% so rare spikes do not drive sizing - a robust peak. Conversely, frequently recurring load (e.g., a daily batch spike) exceeds the 5% threshold and is included in p95, so that host is correctly held (the bursty demo host stays unchanged).</w:t>
+      </w:r>
+    </w:p>
+    <w:p>
+      <w:pPr>
+        <w:pStyle w:val="Body"/>
+      </w:pPr>
+      <w:r>
+        <w:rPr>
+          <w:rFonts w:eastAsia="Malgun Gothic"/>
+        </w:rPr>
+        <w:t>The engine picks the smallest integer allocation keeping the robust-peak utilisation under target while preserving a margin: p95_peak * safety_margin &lt;= target_utilisation * allocation. safety_margin (e.g. 1.2) absorbs forecast error; target_utilisation (e.g. 0.65) is the steady-state ceiling. The bounded space (vCPU in [1, current], memory in 256 MB blocks) is solved by exact enumeration; vCPU and memory are optimised independently.</w:t>
       </w:r>
     </w:p>
     <w:p>
@@ -446,18 +424,18 @@
         <w:rPr>
           <w:rFonts w:eastAsia="Malgun Gothic"/>
         </w:rPr>
-        <w:t>4.2. GCP 머신 타입 매핑과 예산 가드 실제 리사이즈</w:t>
-      </w:r>
-    </w:p>
-    <w:p>
-      <w:pPr>
-        <w:pStyle w:val="Body"/>
-      </w:pPr>
-      <w:r>
-        <w:rPr>
-          <w:rFonts w:eastAsia="Malgun Gothic"/>
-        </w:rPr>
-        <w:t>추상적 (vcpu, memory) 권장값은 사전정의 GCP 인스턴스(E2/N2/C2/C3)로 스냅된다. 실제 GCE 호스트는 Compute API로 머신 타입을 변경하여 물리적으로 리사이즈하되, 월 비용이 한도(예: 300,000원/월)를 초과하는 타입은 거부하고, 보호 인스턴스 목록(작업 머신 등)은 변경 대상에서 제외한다.</w:t>
+        <w:t>4.2. GCP machine-type mapping and budget-guarded real resize</w:t>
+      </w:r>
+    </w:p>
+    <w:p>
+      <w:pPr>
+        <w:pStyle w:val="Body"/>
+      </w:pPr>
+      <w:r>
+        <w:rPr>
+          <w:rFonts w:eastAsia="Malgun Gothic"/>
+        </w:rPr>
+        <w:t>Abstract (vcpu, memory) recommendations snap to predefined GCP instances (E2/N2/C2/C3). Real GCE hosts are physically resized via the Compute API, but a machine type whose monthly cost exceeds the budget (e.g. 300,000 KRW/month) is rejected, and protected instances (e.g. the work machine) are excluded.</w:t>
       </w:r>
     </w:p>
     <w:p>
@@ -468,40 +446,40 @@
         <w:rPr>
           <w:rFonts w:eastAsia="Malgun Gothic"/>
         </w:rPr>
-        <w:t>5. 구현 및 배포</w:t>
-      </w:r>
-    </w:p>
-    <w:p>
-      <w:pPr>
-        <w:pStyle w:val="Body"/>
-      </w:pPr>
-      <w:r>
-        <w:rPr>
-          <w:rFonts w:eastAsia="Malgun Gothic"/>
-        </w:rPr>
-        <w:t>백엔드는 SQLAlchemy 2.0 async의 FastAPI, 프론트엔드는 Vite 빌드 React 19(nginx 서빙)이며 둘 다 비루트 컨테이너로 Cloud Run에 배포된다. 대시보드는 상단 메뉴로 Dashboard / History(전체 메트릭·활동 로그 열람) / Test Scenarios(예측·최적화·실제 GCP 동기화·실제 리사이즈·모델 평가 실행)를 제공한다. 모든 예측·리사이즈는 감사 로그 테이블에 영속 기록된다. 실제 인스턴스 플릿은 다양한 일주기 부하 생성기를 구동하여 Cloud Monitoring에 대표적인 실측 신호를 남긴다.</w:t>
-      </w:r>
-    </w:p>
-    <w:p>
-      <w:pPr>
-        <w:pStyle w:val="Body"/>
-      </w:pPr>
-      <w:r>
-        <w:rPr>
-          <w:rFonts w:eastAsia="Malgun Gothic"/>
-        </w:rPr>
-        <w:t>라이브 대시보드: https://metriclens-frontend-f2ei3uwvfq-uc.a.run.app</w:t>
-      </w:r>
-    </w:p>
-    <w:p>
-      <w:pPr>
-        <w:pStyle w:val="Body"/>
-      </w:pPr>
-      <w:r>
-        <w:rPr>
-          <w:rFonts w:eastAsia="Malgun Gothic"/>
-        </w:rPr>
-        <w:t>라이브 API (Swagger /docs): https://metriclens-backend-f2ei3uwvfq-uc.a.run.app</w:t>
+        <w:t>5. Implementation and Deployment</w:t>
+      </w:r>
+    </w:p>
+    <w:p>
+      <w:pPr>
+        <w:pStyle w:val="Body"/>
+      </w:pPr>
+      <w:r>
+        <w:rPr>
+          <w:rFonts w:eastAsia="Malgun Gothic"/>
+        </w:rPr>
+        <w:t>The backend is FastAPI with SQLAlchemy 2.0 async; the frontend is React 19 built with Vite and served by nginx; both run as non-root containers on Cloud Run. The dashboard's top menu offers Dashboard / History (full metric tables + activity log) / Test Scenarios (forecast, optimise, real GCP sync, real resize, model evaluation). Every forecast and resize is persisted to an audit-log table. The real fleet runs diurnal load generators so Cloud Monitoring records a representative live signal.</w:t>
+      </w:r>
+    </w:p>
+    <w:p>
+      <w:pPr>
+        <w:pStyle w:val="Body"/>
+      </w:pPr>
+      <w:r>
+        <w:rPr>
+          <w:rFonts w:eastAsia="Malgun Gothic"/>
+        </w:rPr>
+        <w:t>Live dashboard: https://metriclens-frontend-f2ei3uwvfq-uc.a.run.app</w:t>
+      </w:r>
+    </w:p>
+    <w:p>
+      <w:pPr>
+        <w:pStyle w:val="Body"/>
+      </w:pPr>
+      <w:r>
+        <w:rPr>
+          <w:rFonts w:eastAsia="Malgun Gothic"/>
+        </w:rPr>
+        <w:t>Live API (Swagger /docs): https://metriclens-backend-f2ei3uwvfq-uc.a.run.app</w:t>
       </w:r>
     </w:p>
     <w:p>
@@ -512,18 +490,18 @@
         <w:rPr>
           <w:rFonts w:eastAsia="Malgun Gothic"/>
         </w:rPr>
-        <w:t>6. 시험 데이터의 통계적 대표성</w:t>
-      </w:r>
-    </w:p>
-    <w:p>
-      <w:pPr>
-        <w:pStyle w:val="Body"/>
-      </w:pPr>
-      <w:r>
-        <w:rPr>
-          <w:rFonts w:eastAsia="Malgun Gothic"/>
-        </w:rPr>
-        <w:t>데모/시드 메트릭은 공개 트레이스의 실측 통계에 근거한다. Azure Resource Central(SOSP'17): VM 60%가 평균 CPU&lt;20%, 대화형/지연무관 분류. Barroso &amp; Hölzle: 서버는 대부분 10–50% 대역. Alibaba 2018: 배치 평균 29.3%, 서비스 7.4%. 이에 6개 워크로드 아키타입을 14일×시간단위로 생성하되, 단순 반복 곡선이 아니라 AR(1) 자기상관·날짜별 진폭 변동·완만한 추세·이분산 잡음·희귀 이상치를 가산한다. 생성 데이터의 변동계수(CV)는 0.28–1.11, 시차-1 자기상관은 0.5–0.9로 실측 분포와 일치한다(균일 합성 데이터의 CV≈0과 대조).</w:t>
+        <w:t>6. Statistical Representativeness of the Test Data</w:t>
+      </w:r>
+    </w:p>
+    <w:p>
+      <w:pPr>
+        <w:pStyle w:val="Body"/>
+      </w:pPr>
+      <w:r>
+        <w:rPr>
+          <w:rFonts w:eastAsia="Malgun Gothic"/>
+        </w:rPr>
+        <w:t>Demo/seed metrics are grounded in public traces: Azure Resource Central (SOSP'17; 60% of VMs average &lt; 20% CPU; interactive vs delay-insensitive), Barroso &amp; Holzle (servers mostly 10-50%), Alibaba 2018 (batch ~29.3%, service ~7.4%). Six archetypes are generated over 14 days hourly, not as a repeating curve but with AR(1) autocorrelation, day-to-day amplitude variation, a slow trend, heteroscedastic noise, and rare anomalies. The generated coefficient of variation is 0.28-1.11 and lag-1 autocorrelation 0.5-0.9, matching real distributions (versus ~0 for uniform synthetic data).</w:t>
       </w:r>
     </w:p>
     <w:p>
@@ -534,36 +512,36 @@
         <w:rPr>
           <w:rFonts w:eastAsia="Malgun Gothic"/>
         </w:rPr>
-        <w:t>7. 모델 평가 (논문 수준)</w:t>
-      </w:r>
-    </w:p>
-    <w:p>
-      <w:pPr>
-        <w:pStyle w:val="Body"/>
-      </w:pPr>
-      <w:r>
-        <w:rPr>
-          <w:rFonts w:eastAsia="Malgun Gothic"/>
-        </w:rPr>
-        <w:t>균일 데이터의 단일 MAPE는 모델 유효성을 입증하지 못한다. 따라서 확장 윈도우 1-스텝 백테스트로 두 표준 기준선(naive=직전값, seasonal-naive=한 주기 전 값)과 비교하고, 학술 표준 지표인 MASE(Hyndman &amp; Koehler 2006), sMAPE, RMSE를 보고하며, 예측구간 보정도를 PICP(커버리지)·MPIW(폭)로 측정하고, Diebold-Mariano 검정(1995)으로 예측 정확도 차이의 통계적 유의성을 평가한다.</w:t>
-      </w:r>
-    </w:p>
-    <w:p>
-      <w:pPr>
-        <w:pStyle w:val="Body"/>
-      </w:pPr>
-      <w:r>
-        <w:rPr>
-          <w:rFonts w:eastAsia="Malgun Gothic"/>
-        </w:rPr>
-        <w:t>결과: 모델은 6/6 아키타입에서 seasonal-naive를 RMSE로 능가하고, 5/6에서 MASE&lt;1(seasonal-naive 대비 우수), 4/6에서 Diebold-Mariano p&lt;0.05로 유의하게 우수하다. 예측구간 커버리지는 0.93–0.98(공칭 0.95)로 잘 보정된다. 저활용 워크로드(steady_cache·devtest)는 직전값 기준선이 매우 강해 유의성이 낮은데, 이는 평탄·준유휴 신호의 본질적 특성으로 정직하게 보고한다.</w:t>
+        <w:t>7. Model Evaluation (Paper-Level)</w:t>
+      </w:r>
+    </w:p>
+    <w:p>
+      <w:pPr>
+        <w:pStyle w:val="Body"/>
+      </w:pPr>
+      <w:r>
+        <w:rPr>
+          <w:rFonts w:eastAsia="Malgun Gothic"/>
+        </w:rPr>
+        <w:t>A single MAPE on uniform data cannot prove validity. The model is compared against two standard baselines (naive = last value, seasonal-naive = value one period ago) on an expanding-window one-step backtest, with academic statistics MASE (Hyndman &amp; Koehler 2006), sMAPE, RMSE; interval calibration via PICP (coverage) and MPIW (width); and the Diebold-Mariano test (1995) for statistical significance.</w:t>
+      </w:r>
+    </w:p>
+    <w:p>
+      <w:pPr>
+        <w:pStyle w:val="Body"/>
+      </w:pPr>
+      <w:r>
+        <w:rPr>
+          <w:rFonts w:eastAsia="Malgun Gothic"/>
+        </w:rPr>
+        <w:t>Results: the model beats seasonal-naive (RMSE) on all 6 archetypes, MASE &lt; 1 on 5/6, and is significantly better (Diebold-Mariano p&lt;0.05) on 4/6. Interval coverage is 0.93-0.98 (nominal 0.95). For flat/idle workloads the last-value baseline is strong, so significance is lower there - an honest property of those signals.</w:t>
       </w:r>
     </w:p>
     <w:p>
       <w:r>
         <w:drawing>
           <wp:inline xmlns:a="http://schemas.openxmlformats.org/drawingml/2006/main" xmlns:pic="http://schemas.openxmlformats.org/drawingml/2006/picture">
-            <wp:extent cx="3017520" cy="2263140"/>
+            <wp:extent cx="5120640" cy="3840480"/>
             <wp:docPr id="4" name="Picture 4"/>
             <wp:cNvGraphicFramePr>
               <a:graphicFrameLocks noChangeAspect="1"/>
@@ -584,7 +562,7 @@
                   <pic:spPr>
                     <a:xfrm>
                       <a:off x="0" y="0"/>
-                      <a:ext cx="3017520" cy="2263140"/>
+                      <a:ext cx="5120640" cy="3840480"/>
                     </a:xfrm>
                     <a:prstGeom prst="rect"/>
                   </pic:spPr>
@@ -603,14 +581,14 @@
         <w:rPr>
           <w:rFonts w:eastAsia="Malgun Gothic"/>
         </w:rPr>
-        <w:t>그림 4. 1-스텝 예측 vs 실측과 95% 예측구간(대화형·배치 아키타입).</w:t>
+        <w:t>Figure 4. One-step forecast vs actual with the 95% interval.</w:t>
       </w:r>
     </w:p>
     <w:p>
       <w:r>
         <w:drawing>
           <wp:inline xmlns:a="http://schemas.openxmlformats.org/drawingml/2006/main" xmlns:pic="http://schemas.openxmlformats.org/drawingml/2006/picture">
-            <wp:extent cx="3017520" cy="1508760"/>
+            <wp:extent cx="5486400" cy="2743200"/>
             <wp:docPr id="5" name="Picture 5"/>
             <wp:cNvGraphicFramePr>
               <a:graphicFrameLocks noChangeAspect="1"/>
@@ -631,7 +609,7 @@
                   <pic:spPr>
                     <a:xfrm>
                       <a:off x="0" y="0"/>
-                      <a:ext cx="3017520" cy="1508760"/>
+                      <a:ext cx="5486400" cy="2743200"/>
                     </a:xfrm>
                     <a:prstGeom prst="rect"/>
                   </pic:spPr>
@@ -650,14 +628,14 @@
         <w:rPr>
           <w:rFonts w:eastAsia="Malgun Gothic"/>
         </w:rPr>
-        <w:t>그림 5. 예측 오차(RMSE): 모델 vs 기준선(낮을수록 우수).</w:t>
+        <w:t>Figure 5. Forecast error (RMSE): model vs baselines (lower is better).</w:t>
       </w:r>
     </w:p>
     <w:p>
       <w:r>
         <w:drawing>
           <wp:inline xmlns:a="http://schemas.openxmlformats.org/drawingml/2006/main" xmlns:pic="http://schemas.openxmlformats.org/drawingml/2006/picture">
-            <wp:extent cx="3017520" cy="1508760"/>
+            <wp:extent cx="5486400" cy="2743200"/>
             <wp:docPr id="6" name="Picture 6"/>
             <wp:cNvGraphicFramePr>
               <a:graphicFrameLocks noChangeAspect="1"/>
@@ -678,7 +656,7 @@
                   <pic:spPr>
                     <a:xfrm>
                       <a:off x="0" y="0"/>
-                      <a:ext cx="3017520" cy="1508760"/>
+                      <a:ext cx="5486400" cy="2743200"/>
                     </a:xfrm>
                     <a:prstGeom prst="rect"/>
                   </pic:spPr>
@@ -697,14 +675,14 @@
         <w:rPr>
           <w:rFonts w:eastAsia="Malgun Gothic"/>
         </w:rPr>
-        <w:t>그림 6. MASE — 1 미만이면 seasonal-naive를 능가.</w:t>
+        <w:t>Figure 6. MASE - below 1 beats seasonal-naive.</w:t>
       </w:r>
     </w:p>
     <w:p>
       <w:r>
         <w:drawing>
           <wp:inline xmlns:a="http://schemas.openxmlformats.org/drawingml/2006/main" xmlns:pic="http://schemas.openxmlformats.org/drawingml/2006/picture">
-            <wp:extent cx="3017520" cy="1508760"/>
+            <wp:extent cx="5486400" cy="2743200"/>
             <wp:docPr id="7" name="Picture 7"/>
             <wp:cNvGraphicFramePr>
               <a:graphicFrameLocks noChangeAspect="1"/>
@@ -725,7 +703,7 @@
                   <pic:spPr>
                     <a:xfrm>
                       <a:off x="0" y="0"/>
-                      <a:ext cx="3017520" cy="1508760"/>
+                      <a:ext cx="5486400" cy="2743200"/>
                     </a:xfrm>
                     <a:prstGeom prst="rect"/>
                   </pic:spPr>
@@ -744,14 +722,14 @@
         <w:rPr>
           <w:rFonts w:eastAsia="Malgun Gothic"/>
         </w:rPr>
-        <w:t>그림 7. 95% 예측구간 보정(PICP) — 공칭 0.95 대비.</w:t>
+        <w:t>Figure 7. 95% prediction-interval calibration (PICP) vs nominal 0.95.</w:t>
       </w:r>
     </w:p>
     <w:p>
       <w:r>
         <w:drawing>
           <wp:inline xmlns:a="http://schemas.openxmlformats.org/drawingml/2006/main" xmlns:pic="http://schemas.openxmlformats.org/drawingml/2006/picture">
-            <wp:extent cx="3017520" cy="1357884"/>
+            <wp:extent cx="5486400" cy="2468880"/>
             <wp:docPr id="8" name="Picture 8"/>
             <wp:cNvGraphicFramePr>
               <a:graphicFrameLocks noChangeAspect="1"/>
@@ -772,7 +750,7 @@
                   <pic:spPr>
                     <a:xfrm>
                       <a:off x="0" y="0"/>
-                      <a:ext cx="3017520" cy="1357884"/>
+                      <a:ext cx="5486400" cy="2468880"/>
                     </a:xfrm>
                     <a:prstGeom prst="rect"/>
                   </pic:spPr>
@@ -791,7 +769,7 @@
         <w:rPr>
           <w:rFonts w:eastAsia="Malgun Gothic"/>
         </w:rPr>
-        <w:t>그림 8. 잔차 자기상관 — 백색잡음 대역 내면 적합 양호.</w:t>
+        <w:t>Figure 8. Residual autocorrelation - within the white-noise band = good fit.</w:t>
       </w:r>
     </w:p>
     <w:p>
@@ -802,18 +780,18 @@
         <w:rPr>
           <w:rFonts w:eastAsia="Malgun Gothic"/>
         </w:rPr>
-        <w:t>8. 관련 연구 및 차별화</w:t>
-      </w:r>
-    </w:p>
-    <w:p>
-      <w:pPr>
-        <w:pStyle w:val="Body"/>
-      </w:pPr>
-      <w:r>
-        <w:rPr>
-          <w:rFonts w:eastAsia="Malgun Gothic"/>
-        </w:rPr>
-        <w:t>시장은 (a) 쿠버네티스/클라우드 SaaS 최적화기(CAST AI·Sedai·StormForge — 텔레메트리 외부 전송·K8s 전제), (b) CSP 추천기(AWS Compute Optimizer·Azure Advisor — 단일 클라우드·짧은 윈도우), (c) 온프레 모니터(SolarWinds·ManageEngine — 임계치 기반 서술적 리포팅)로 나뉜다. MetricLens는 그 사이의 공백을 차지한다: (1) 에어갭·자립형, (2) GPU-프리 경량, (3) SLO 제약 처방적 정수계획, (4) 화이트박스 설명가능성, (5) 인프라 비종속(일반 VM/베어메탈).</w:t>
+        <w:t>8. Related Work and Differentiation</w:t>
+      </w:r>
+    </w:p>
+    <w:p>
+      <w:pPr>
+        <w:pStyle w:val="Body"/>
+      </w:pPr>
+      <w:r>
+        <w:rPr>
+          <w:rFonts w:eastAsia="Malgun Gothic"/>
+        </w:rPr>
+        <w:t>The market splits into (a) Kubernetes/cloud SaaS optimizers (CAST AI, Sedai, StormForge - telemetry egress, K8s-assumed), (b) cloud-provider recommenders (AWS Compute Optimizer, Azure Advisor - single cloud, short windows), and (c) on-prem monitors (SolarWinds, ManageEngine - threshold-based descriptive reporting). MetricLens occupies the gap: (1) air-gapped and self-contained, (2) GPU-free and lightweight, (3) prescriptive SLO-constrained integer programming, (4) white-box explainability, (5) infrastructure-agnostic (generic VM/bare-metal).</w:t>
       </w:r>
     </w:p>
     <w:p>
@@ -824,18 +802,18 @@
         <w:rPr>
           <w:rFonts w:eastAsia="Malgun Gothic"/>
         </w:rPr>
-        <w:t>9. 결론</w:t>
-      </w:r>
-    </w:p>
-    <w:p>
-      <w:pPr>
-        <w:pStyle w:val="Body"/>
-      </w:pPr>
-      <w:r>
-        <w:rPr>
-          <w:rFonts w:eastAsia="Malgun Gothic"/>
-        </w:rPr>
-        <w:t>MetricLens AI는 정확한 CPU-온리 예측과 정수계획 리사이징을 의존성 없는 클라우드 네이티브 서비스로 제공하고, 실제 GCP 인스턴스를 모니터링·리사이즈하며, 모델 유효성을 논문 수준의 평가(기준선 대비·MASE·Diebold-Mariano·구간 보정)로 입증한다. 수동적 텔레메트리를 정량적·SLO 인지 사이징 지침으로 전환함으로써, 온프레미스 인프라의 비용과 전력 낭비를 줄이는 실용적 경로를 제시한다.</w:t>
+        <w:t>9. Conclusion</w:t>
+      </w:r>
+    </w:p>
+    <w:p>
+      <w:pPr>
+        <w:pStyle w:val="Body"/>
+      </w:pPr>
+      <w:r>
+        <w:rPr>
+          <w:rFonts w:eastAsia="Malgun Gothic"/>
+        </w:rPr>
+        <w:t>MetricLens AI delivers accurate CPU-only forecasting and exact integer-programming resizing as a dependency-free, cloud-native service, monitors and resizes real GCP instances, and proves model validity with a paper-level evaluation (baselines, MASE, Diebold-Mariano, interval calibration). By turning passive telemetry into quantitative, SLO-aware sizing guidance, it offers a practical path to cutting infrastructure cost and energy waste on-premise.</w:t>
       </w:r>
     </w:p>
     <w:sectPr>

</xml_diff>

<commit_message>
Paper-style figures: white boxes, black lines, official icons, no overlap
Architecture diagram refactored to 3 logical layers + a separate cross-cutting
Runtime/CI-CD section (not a 4th layer). All diagrams (architecture, runtime,
approach) switched to a white-fill / thin-black-line paper palette with official
Simple Icons; runtime uses orthogonal arrow routing so flows never cross.
Regenerated EN + _kr figures, deck slides, and both USENIX reports.

Co-Authored-By: Claude Opus 4.8 (1M context) <noreply@anthropic.com>
</commit_message>
<xml_diff>
--- a/docs/development_report_usenix.docx
+++ b/docs/development_report_usenix.docx
@@ -158,7 +158,7 @@
       <w:r>
         <w:drawing>
           <wp:inline xmlns:a="http://schemas.openxmlformats.org/drawingml/2006/main" xmlns:pic="http://schemas.openxmlformats.org/drawingml/2006/picture">
-            <wp:extent cx="5852160" cy="4213555"/>
+            <wp:extent cx="5852160" cy="3885834"/>
             <wp:docPr id="1" name="Picture 1"/>
             <wp:cNvGraphicFramePr>
               <a:graphicFrameLocks noChangeAspect="1"/>
@@ -179,7 +179,7 @@
                   <pic:spPr>
                     <a:xfrm>
                       <a:off x="0" y="0"/>
-                      <a:ext cx="5852160" cy="4213555"/>
+                      <a:ext cx="5852160" cy="3885834"/>
                     </a:xfrm>
                     <a:prstGeom prst="rect"/>
                   </pic:spPr>
@@ -227,7 +227,7 @@
       <w:r>
         <w:drawing>
           <wp:inline xmlns:a="http://schemas.openxmlformats.org/drawingml/2006/main" xmlns:pic="http://schemas.openxmlformats.org/drawingml/2006/picture">
-            <wp:extent cx="5852160" cy="3080084"/>
+            <wp:extent cx="5852160" cy="3182754"/>
             <wp:docPr id="2" name="Picture 2"/>
             <wp:cNvGraphicFramePr>
               <a:graphicFrameLocks noChangeAspect="1"/>
@@ -248,7 +248,7 @@
                   <pic:spPr>
                     <a:xfrm>
                       <a:off x="0" y="0"/>
-                      <a:ext cx="5852160" cy="3080084"/>
+                      <a:ext cx="5852160" cy="3182754"/>
                     </a:xfrm>
                     <a:prstGeom prst="rect"/>
                   </pic:spPr>

</xml_diff>

<commit_message>
Update report §2 for the 3-layer + separate cross-cutting runtime/CI-CD framing
Report body and Figure 1 caption now state three logical layers with the runtime
platform & CI/CD as a separate cross-cutting tier (not a 4th layer), matching the
redesigned diagram. Regenerated EN + KR docx; markdown report §2 updated too.

Co-Authored-By: Claude Opus 4.8 (1M context) <noreply@anthropic.com>
</commit_message>
<xml_diff>
--- a/docs/development_report_usenix.docx
+++ b/docs/development_report_usenix.docx
@@ -151,7 +151,7 @@
         <w:rPr>
           <w:rFonts w:eastAsia="Malgun Gothic"/>
         </w:rPr>
-        <w:t>The system follows a three-tier layered architecture: a React 19 SPA served by an unprivileged nginx container; a single FastAPI app internally split into Controller, Service, and Repository layers with the forecasting/optimization core isolated as pure, dependency-free code; and a data tier of PostgreSQL (Cloud SQL) in production or embedded SQLite for the demo.</w:t>
+        <w:t>The architecture is organised as three logical layers, with the runtime platform and CI/CD modelled as a separate cross-cutting tier rather than a fourth layer. The Presentation layer is a React 19 SPA served by an unprivileged nginx container; the Business layer is a single FastAPI app internally split into Controller, Service, and Repository, with the forecasting/optimization core isolated as pure, dependency-free code; and the Data layer is PostgreSQL (Cloud SQL) in production or embedded SQLite for the demo. Dependencies flow strictly downward, and the pure core is unit-tested without a database.</w:t>
       </w:r>
     </w:p>
     <w:p>
@@ -198,7 +198,7 @@
         <w:rPr>
           <w:rFonts w:eastAsia="Malgun Gothic"/>
         </w:rPr>
-        <w:t>Figure 1. Layered system architecture (official OSS brand logos).</w:t>
+        <w:t>Figure 1. Three logical layers; runtime platform &amp; CI/CD as a separate cross-cutting tier (official OSS brand logos).</w:t>
       </w:r>
     </w:p>
     <w:p>

</xml_diff>